<commit_message>
Updated behavior and solution approach with newly communicated design concerns. Refactoring.
</commit_message>
<xml_diff>
--- a/doc/assurance/ZoneAlertService/2-Presentation/proposedZoneAlertBehaviors.docx
+++ b/doc/assurance/ZoneAlertService/2-Presentation/proposedZoneAlertBehaviors.docx
@@ -79,14 +79,14 @@
                         </a:ln>
                         <a:extLst>
                           <a:ext uri="{909E8E84-426E-40dd-AFC4-6F175D3DCCD1}">
-                            <a14:hiddenFill xmlns:mo="http://schemas.microsoft.com/office/mac/office/2008/main" xmlns:mv="urn:schemas-microsoft-com:mac:vml" xmlns:a14="http://schemas.microsoft.com/office/drawing/2010/main" xmlns:w="http://schemas.openxmlformats.org/wordprocessingml/2006/main" xmlns:w10="urn:schemas-microsoft-com:office:word" xmlns:v="urn:schemas-microsoft-com:vml" xmlns:o="urn:schemas-microsoft-com:office:office" xmlns="">
+                            <a14:hiddenFill xmlns="" xmlns:o="urn:schemas-microsoft-com:office:office" xmlns:v="urn:schemas-microsoft-com:vml" xmlns:w10="urn:schemas-microsoft-com:office:word" xmlns:w="http://schemas.openxmlformats.org/wordprocessingml/2006/main" xmlns:a14="http://schemas.microsoft.com/office/drawing/2010/main" xmlns:mv="urn:schemas-microsoft-com:mac:vml" xmlns:mo="http://schemas.microsoft.com/office/mac/office/2008/main">
                               <a:solidFill>
                                 <a:srgbClr val="FFFFFF"/>
                               </a:solidFill>
                             </a14:hiddenFill>
                           </a:ext>
                           <a:ext uri="{91240B29-F687-4f45-9708-019B960494DF}">
-                            <a14:hiddenLine xmlns:mo="http://schemas.microsoft.com/office/mac/office/2008/main" xmlns:mv="urn:schemas-microsoft-com:mac:vml" xmlns:a14="http://schemas.microsoft.com/office/drawing/2010/main" xmlns:w="http://schemas.openxmlformats.org/wordprocessingml/2006/main" xmlns:w10="urn:schemas-microsoft-com:office:word" xmlns:v="urn:schemas-microsoft-com:vml" xmlns:o="urn:schemas-microsoft-com:office:office" xmlns="" w="9525">
+                            <a14:hiddenLine xmlns="" xmlns:o="urn:schemas-microsoft-com:office:office" xmlns:v="urn:schemas-microsoft-com:vml" xmlns:w10="urn:schemas-microsoft-com:office:word" xmlns:w="http://schemas.openxmlformats.org/wordprocessingml/2006/main" xmlns:a14="http://schemas.microsoft.com/office/drawing/2010/main" xmlns:mv="urn:schemas-microsoft-com:mac:vml" xmlns:mo="http://schemas.microsoft.com/office/mac/office/2008/main" w="9525">
                               <a:solidFill>
                                 <a:srgbClr val="000000"/>
                               </a:solidFill>
@@ -297,7 +297,7 @@
                         </a:effectLst>
                         <a:extLst>
                           <a:ext uri="{909E8E84-426E-40dd-AFC4-6F175D3DCCD1}">
-                            <a14:hiddenFill xmlns:mo="http://schemas.microsoft.com/office/mac/office/2008/main" xmlns:mv="urn:schemas-microsoft-com:mac:vml" xmlns:a14="http://schemas.microsoft.com/office/drawing/2010/main" xmlns:w="http://schemas.openxmlformats.org/wordprocessingml/2006/main" xmlns:w10="urn:schemas-microsoft-com:office:word" xmlns:v="urn:schemas-microsoft-com:vml" xmlns:o="urn:schemas-microsoft-com:office:office" xmlns="">
+                            <a14:hiddenFill xmlns="" xmlns:o="urn:schemas-microsoft-com:office:office" xmlns:v="urn:schemas-microsoft-com:vml" xmlns:w10="urn:schemas-microsoft-com:office:word" xmlns:w="http://schemas.openxmlformats.org/wordprocessingml/2006/main" xmlns:a14="http://schemas.microsoft.com/office/drawing/2010/main" xmlns:mv="urn:schemas-microsoft-com:mac:vml" xmlns:mo="http://schemas.microsoft.com/office/mac/office/2008/main">
                               <a:noFill/>
                             </a14:hiddenFill>
                           </a:ext>
@@ -377,14 +377,14 @@
                         </a:ln>
                         <a:extLst>
                           <a:ext uri="{909E8E84-426E-40dd-AFC4-6F175D3DCCD1}">
-                            <a14:hiddenFill xmlns:mo="http://schemas.microsoft.com/office/mac/office/2008/main" xmlns:mv="urn:schemas-microsoft-com:mac:vml" xmlns:a14="http://schemas.microsoft.com/office/drawing/2010/main" xmlns:w="http://schemas.openxmlformats.org/wordprocessingml/2006/main" xmlns:w10="urn:schemas-microsoft-com:office:word" xmlns:v="urn:schemas-microsoft-com:vml" xmlns:o="urn:schemas-microsoft-com:office:office" xmlns="">
+                            <a14:hiddenFill xmlns="" xmlns:o="urn:schemas-microsoft-com:office:office" xmlns:v="urn:schemas-microsoft-com:vml" xmlns:w10="urn:schemas-microsoft-com:office:word" xmlns:w="http://schemas.openxmlformats.org/wordprocessingml/2006/main" xmlns:a14="http://schemas.microsoft.com/office/drawing/2010/main" xmlns:mv="urn:schemas-microsoft-com:mac:vml" xmlns:mo="http://schemas.microsoft.com/office/mac/office/2008/main">
                               <a:solidFill>
                                 <a:srgbClr val="FFFFFF"/>
                               </a:solidFill>
                             </a14:hiddenFill>
                           </a:ext>
                           <a:ext uri="{91240B29-F687-4f45-9708-019B960494DF}">
-                            <a14:hiddenLine xmlns:mo="http://schemas.microsoft.com/office/mac/office/2008/main" xmlns:mv="urn:schemas-microsoft-com:mac:vml" xmlns:a14="http://schemas.microsoft.com/office/drawing/2010/main" xmlns:w="http://schemas.openxmlformats.org/wordprocessingml/2006/main" xmlns:w10="urn:schemas-microsoft-com:office:word" xmlns:v="urn:schemas-microsoft-com:vml" xmlns:o="urn:schemas-microsoft-com:office:office" xmlns="" w="9525">
+                            <a14:hiddenLine xmlns="" xmlns:o="urn:schemas-microsoft-com:office:office" xmlns:v="urn:schemas-microsoft-com:vml" xmlns:w10="urn:schemas-microsoft-com:office:word" xmlns:w="http://schemas.openxmlformats.org/wordprocessingml/2006/main" xmlns:a14="http://schemas.microsoft.com/office/drawing/2010/main" xmlns:mv="urn:schemas-microsoft-com:mac:vml" xmlns:mo="http://schemas.microsoft.com/office/mac/office/2008/main" w="9525">
                               <a:solidFill>
                                 <a:srgbClr val="000000"/>
                               </a:solidFill>
@@ -514,14 +514,14 @@
                         </a:ln>
                         <a:extLst>
                           <a:ext uri="{909E8E84-426E-40dd-AFC4-6F175D3DCCD1}">
-                            <a14:hiddenFill xmlns:mo="http://schemas.microsoft.com/office/mac/office/2008/main" xmlns:mv="urn:schemas-microsoft-com:mac:vml" xmlns:a14="http://schemas.microsoft.com/office/drawing/2010/main" xmlns:w="http://schemas.openxmlformats.org/wordprocessingml/2006/main" xmlns:w10="urn:schemas-microsoft-com:office:word" xmlns:v="urn:schemas-microsoft-com:vml" xmlns:o="urn:schemas-microsoft-com:office:office" xmlns="">
+                            <a14:hiddenFill xmlns="" xmlns:o="urn:schemas-microsoft-com:office:office" xmlns:v="urn:schemas-microsoft-com:vml" xmlns:w10="urn:schemas-microsoft-com:office:word" xmlns:w="http://schemas.openxmlformats.org/wordprocessingml/2006/main" xmlns:a14="http://schemas.microsoft.com/office/drawing/2010/main" xmlns:mv="urn:schemas-microsoft-com:mac:vml" xmlns:mo="http://schemas.microsoft.com/office/mac/office/2008/main">
                               <a:solidFill>
                                 <a:srgbClr val="FFFFFF"/>
                               </a:solidFill>
                             </a14:hiddenFill>
                           </a:ext>
                           <a:ext uri="{91240B29-F687-4f45-9708-019B960494DF}">
-                            <a14:hiddenLine xmlns:mo="http://schemas.microsoft.com/office/mac/office/2008/main" xmlns:mv="urn:schemas-microsoft-com:mac:vml" xmlns:a14="http://schemas.microsoft.com/office/drawing/2010/main" xmlns:w="http://schemas.openxmlformats.org/wordprocessingml/2006/main" xmlns:w10="urn:schemas-microsoft-com:office:word" xmlns:v="urn:schemas-microsoft-com:vml" xmlns:o="urn:schemas-microsoft-com:office:office" xmlns="" w="9525">
+                            <a14:hiddenLine xmlns="" xmlns:o="urn:schemas-microsoft-com:office:office" xmlns:v="urn:schemas-microsoft-com:vml" xmlns:w10="urn:schemas-microsoft-com:office:word" xmlns:w="http://schemas.openxmlformats.org/wordprocessingml/2006/main" xmlns:a14="http://schemas.microsoft.com/office/drawing/2010/main" xmlns:mv="urn:schemas-microsoft-com:mac:vml" xmlns:mo="http://schemas.microsoft.com/office/mac/office/2008/main" w="9525">
                               <a:solidFill>
                                 <a:srgbClr val="000000"/>
                               </a:solidFill>
@@ -792,7 +792,7 @@
                         </a:effectLst>
                         <a:extLst>
                           <a:ext uri="{909E8E84-426E-40dd-AFC4-6F175D3DCCD1}">
-                            <a14:hiddenFill xmlns:mo="http://schemas.microsoft.com/office/mac/office/2008/main" xmlns:mv="urn:schemas-microsoft-com:mac:vml" xmlns:a14="http://schemas.microsoft.com/office/drawing/2010/main" xmlns:w="http://schemas.openxmlformats.org/wordprocessingml/2006/main" xmlns:w10="urn:schemas-microsoft-com:office:word" xmlns:v="urn:schemas-microsoft-com:vml" xmlns:o="urn:schemas-microsoft-com:office:office" xmlns="">
+                            <a14:hiddenFill xmlns="" xmlns:o="urn:schemas-microsoft-com:office:office" xmlns:v="urn:schemas-microsoft-com:vml" xmlns:w10="urn:schemas-microsoft-com:office:word" xmlns:w="http://schemas.openxmlformats.org/wordprocessingml/2006/main" xmlns:a14="http://schemas.microsoft.com/office/drawing/2010/main" xmlns:mv="urn:schemas-microsoft-com:mac:vml" xmlns:mo="http://schemas.microsoft.com/office/mac/office/2008/main">
                               <a:noFill/>
                             </a14:hiddenFill>
                           </a:ext>
@@ -874,14 +874,14 @@
                         </a:ln>
                         <a:extLst>
                           <a:ext uri="{909E8E84-426E-40dd-AFC4-6F175D3DCCD1}">
-                            <a14:hiddenFill xmlns:mo="http://schemas.microsoft.com/office/mac/office/2008/main" xmlns:mv="urn:schemas-microsoft-com:mac:vml" xmlns:a14="http://schemas.microsoft.com/office/drawing/2010/main" xmlns:w="http://schemas.openxmlformats.org/wordprocessingml/2006/main" xmlns:w10="urn:schemas-microsoft-com:office:word" xmlns:v="urn:schemas-microsoft-com:vml" xmlns:o="urn:schemas-microsoft-com:office:office" xmlns="">
+                            <a14:hiddenFill xmlns="" xmlns:o="urn:schemas-microsoft-com:office:office" xmlns:v="urn:schemas-microsoft-com:vml" xmlns:w10="urn:schemas-microsoft-com:office:word" xmlns:w="http://schemas.openxmlformats.org/wordprocessingml/2006/main" xmlns:a14="http://schemas.microsoft.com/office/drawing/2010/main" xmlns:mv="urn:schemas-microsoft-com:mac:vml" xmlns:mo="http://schemas.microsoft.com/office/mac/office/2008/main">
                               <a:solidFill>
                                 <a:srgbClr val="FFFFFF"/>
                               </a:solidFill>
                             </a14:hiddenFill>
                           </a:ext>
                           <a:ext uri="{91240B29-F687-4f45-9708-019B960494DF}">
-                            <a14:hiddenLine xmlns:mo="http://schemas.microsoft.com/office/mac/office/2008/main" xmlns:mv="urn:schemas-microsoft-com:mac:vml" xmlns:a14="http://schemas.microsoft.com/office/drawing/2010/main" xmlns:w="http://schemas.openxmlformats.org/wordprocessingml/2006/main" xmlns:w10="urn:schemas-microsoft-com:office:word" xmlns:v="urn:schemas-microsoft-com:vml" xmlns:o="urn:schemas-microsoft-com:office:office" xmlns="" w="9525">
+                            <a14:hiddenLine xmlns="" xmlns:o="urn:schemas-microsoft-com:office:office" xmlns:v="urn:schemas-microsoft-com:vml" xmlns:w10="urn:schemas-microsoft-com:office:word" xmlns:w="http://schemas.openxmlformats.org/wordprocessingml/2006/main" xmlns:a14="http://schemas.microsoft.com/office/drawing/2010/main" xmlns:mv="urn:schemas-microsoft-com:mac:vml" xmlns:mo="http://schemas.microsoft.com/office/mac/office/2008/main" w="9525">
                               <a:solidFill>
                                 <a:srgbClr val="000000"/>
                               </a:solidFill>
@@ -5606,7 +5606,7 @@
         </w:numPr>
         <w:rPr>
           <w:rFonts w:eastAsiaTheme="minorEastAsia"/>
-          <w:color w:val="FF0000"/>
+          <w:color w:val="000000" w:themeColor="text1"/>
         </w:rPr>
       </w:pPr>
       <w:r>
@@ -5614,54 +5614,16 @@
           <w:rFonts w:eastAsiaTheme="minorEastAsia"/>
           <w:b/>
           <w:bCs/>
-          <w:color w:val="FF0000"/>
+          <w:color w:val="000000" w:themeColor="text1"/>
         </w:rPr>
         <w:t>Existing Keep-In Zone Violation</w:t>
       </w:r>
       <w:r>
         <w:rPr>
           <w:rFonts w:eastAsiaTheme="minorEastAsia"/>
-          <w:color w:val="FF0000"/>
+          <w:color w:val="000000" w:themeColor="text1"/>
         </w:rPr>
         <w:t>: For keep-in zones, by the definition of a keep-in zone violation, the vehicle is in zone violation if its present position is outside any keep-in zone it was within when the vehicle first began operations.</w:t>
-      </w:r>
-    </w:p>
-    <w:p>
-      <w:pPr>
-        <w:pStyle w:val="ListParagraph"/>
-        <w:numPr>
-          <w:ilvl w:val="1"/>
-          <w:numId w:val="85"/>
-        </w:numPr>
-        <w:rPr>
-          <w:rFonts w:eastAsiaTheme="minorEastAsia"/>
-          <w:color w:val="FF0000"/>
-        </w:rPr>
-      </w:pPr>
-      <w:r>
-        <w:rPr>
-          <w:rFonts w:eastAsiaTheme="minorEastAsia"/>
-          <w:b/>
-          <w:bCs/>
-          <w:color w:val="FF0000"/>
-        </w:rPr>
-        <w:t>Alternative</w:t>
-      </w:r>
-      <w:r>
-        <w:rPr>
-          <w:rFonts w:eastAsiaTheme="minorEastAsia"/>
-          <w:b/>
-          <w:bCs/>
-          <w:color w:val="FF0000"/>
-        </w:rPr>
-        <w:t xml:space="preserve"> Definition for Review</w:t>
-      </w:r>
-      <w:r>
-        <w:rPr>
-          <w:rFonts w:eastAsiaTheme="minorEastAsia"/>
-          <w:color w:val="FF0000"/>
-        </w:rPr>
-        <w:t>: A violation exists if it is outside a merged keep-in zone that it was within in the previously received state report from an earlier time.</w:t>
       </w:r>
     </w:p>
     <w:p>
@@ -7082,14 +7044,7 @@
         <w:rPr>
           <w:lang w:eastAsia="en-US"/>
         </w:rPr>
-        <w:t xml:space="preserve"> and </w:t>
-      </w:r>
-      <w:r>
-        <w:rPr>
-          <w:lang w:eastAsia="en-US"/>
-        </w:rPr>
-        <w:lastRenderedPageBreak/>
-        <w:t xml:space="preserve">the assumed position of the vehicle at the present time is calculated based on the above linear equation. </w:t>
+        <w:t xml:space="preserve"> and the assumed position of the vehicle at the present time is calculated based on the above linear equation. </w:t>
       </w:r>
     </w:p>
     <w:p>
@@ -7111,6 +7066,7 @@
         <w:rPr>
           <w:lang w:eastAsia="en-US"/>
         </w:rPr>
+        <w:lastRenderedPageBreak/>
         <w:t>Given the above, zone violations are reported for relevant zones for a vehicle as follows:</w:t>
       </w:r>
     </w:p>
@@ -8636,14 +8592,7 @@
         <w:rPr>
           <w:lang w:eastAsia="en-US"/>
         </w:rPr>
-        <w:t xml:space="preserve">It is important to note this behavior. If the last reported state position is in the distant past relative to the rate of iterative reporting of the Zone Alert Service, then it is possible that a projected violation will be projected to start and end before the current iteration of the Zone Alert Service (e.g., a vehicle is projected to have passed completely over a keep-out zone </w:t>
-      </w:r>
-      <w:r>
-        <w:rPr>
-          <w:lang w:eastAsia="en-US"/>
-        </w:rPr>
-        <w:lastRenderedPageBreak/>
-        <w:t>before the current Zone Alert Service iteration.) The service will not report such events. It reports only events in the future of the current computation time.</w:t>
+        <w:t>It is important to note this behavior. If the last reported state position is in the distant past relative to the rate of iterative reporting of the Zone Alert Service, then it is possible that a projected violation will be projected to start and end before the current iteration of the Zone Alert Service (e.g., a vehicle is projected to have passed completely over a keep-out zone before the current Zone Alert Service iteration.) The service will not report such events. It reports only events in the future of the current computation time.</w:t>
       </w:r>
     </w:p>
     <w:p>
@@ -8657,6 +8606,7 @@
         <w:rPr>
           <w:lang w:eastAsia="en-US"/>
         </w:rPr>
+        <w:lastRenderedPageBreak/>
         <w:t>Repeating Reports</w:t>
       </w:r>
     </w:p>

</xml_diff>

<commit_message>
Updated specifications to assume 2D merged zone semantics for detection of zone violations.
</commit_message>
<xml_diff>
--- a/doc/assurance/ZoneAlertService/2-Presentation/proposedZoneAlertBehaviors.docx
+++ b/doc/assurance/ZoneAlertService/2-Presentation/proposedZoneAlertBehaviors.docx
@@ -79,14 +79,14 @@
                         </a:ln>
                         <a:extLst>
                           <a:ext uri="{909E8E84-426E-40dd-AFC4-6F175D3DCCD1}">
-                            <a14:hiddenFill xmlns="" xmlns:o="urn:schemas-microsoft-com:office:office" xmlns:v="urn:schemas-microsoft-com:vml" xmlns:w10="urn:schemas-microsoft-com:office:word" xmlns:w="http://schemas.openxmlformats.org/wordprocessingml/2006/main" xmlns:a14="http://schemas.microsoft.com/office/drawing/2010/main" xmlns:mv="urn:schemas-microsoft-com:mac:vml" xmlns:mo="http://schemas.microsoft.com/office/mac/office/2008/main">
+                            <a14:hiddenFill xmlns:mo="http://schemas.microsoft.com/office/mac/office/2008/main" xmlns:mv="urn:schemas-microsoft-com:mac:vml" xmlns:a14="http://schemas.microsoft.com/office/drawing/2010/main" xmlns:w="http://schemas.openxmlformats.org/wordprocessingml/2006/main" xmlns:w10="urn:schemas-microsoft-com:office:word" xmlns:v="urn:schemas-microsoft-com:vml" xmlns:o="urn:schemas-microsoft-com:office:office" xmlns="">
                               <a:solidFill>
                                 <a:srgbClr val="FFFFFF"/>
                               </a:solidFill>
                             </a14:hiddenFill>
                           </a:ext>
                           <a:ext uri="{91240B29-F687-4f45-9708-019B960494DF}">
-                            <a14:hiddenLine xmlns="" xmlns:o="urn:schemas-microsoft-com:office:office" xmlns:v="urn:schemas-microsoft-com:vml" xmlns:w10="urn:schemas-microsoft-com:office:word" xmlns:w="http://schemas.openxmlformats.org/wordprocessingml/2006/main" xmlns:a14="http://schemas.microsoft.com/office/drawing/2010/main" xmlns:mv="urn:schemas-microsoft-com:mac:vml" xmlns:mo="http://schemas.microsoft.com/office/mac/office/2008/main" w="9525">
+                            <a14:hiddenLine xmlns:mo="http://schemas.microsoft.com/office/mac/office/2008/main" xmlns:mv="urn:schemas-microsoft-com:mac:vml" xmlns:a14="http://schemas.microsoft.com/office/drawing/2010/main" xmlns:w="http://schemas.openxmlformats.org/wordprocessingml/2006/main" xmlns:w10="urn:schemas-microsoft-com:office:word" xmlns:v="urn:schemas-microsoft-com:vml" xmlns:o="urn:schemas-microsoft-com:office:office" xmlns="" w="9525">
                               <a:solidFill>
                                 <a:srgbClr val="000000"/>
                               </a:solidFill>
@@ -297,7 +297,7 @@
                         </a:effectLst>
                         <a:extLst>
                           <a:ext uri="{909E8E84-426E-40dd-AFC4-6F175D3DCCD1}">
-                            <a14:hiddenFill xmlns="" xmlns:o="urn:schemas-microsoft-com:office:office" xmlns:v="urn:schemas-microsoft-com:vml" xmlns:w10="urn:schemas-microsoft-com:office:word" xmlns:w="http://schemas.openxmlformats.org/wordprocessingml/2006/main" xmlns:a14="http://schemas.microsoft.com/office/drawing/2010/main" xmlns:mv="urn:schemas-microsoft-com:mac:vml" xmlns:mo="http://schemas.microsoft.com/office/mac/office/2008/main">
+                            <a14:hiddenFill xmlns:mo="http://schemas.microsoft.com/office/mac/office/2008/main" xmlns:mv="urn:schemas-microsoft-com:mac:vml" xmlns:a14="http://schemas.microsoft.com/office/drawing/2010/main" xmlns:w="http://schemas.openxmlformats.org/wordprocessingml/2006/main" xmlns:w10="urn:schemas-microsoft-com:office:word" xmlns:v="urn:schemas-microsoft-com:vml" xmlns:o="urn:schemas-microsoft-com:office:office" xmlns="">
                               <a:noFill/>
                             </a14:hiddenFill>
                           </a:ext>
@@ -377,14 +377,14 @@
                         </a:ln>
                         <a:extLst>
                           <a:ext uri="{909E8E84-426E-40dd-AFC4-6F175D3DCCD1}">
-                            <a14:hiddenFill xmlns="" xmlns:o="urn:schemas-microsoft-com:office:office" xmlns:v="urn:schemas-microsoft-com:vml" xmlns:w10="urn:schemas-microsoft-com:office:word" xmlns:w="http://schemas.openxmlformats.org/wordprocessingml/2006/main" xmlns:a14="http://schemas.microsoft.com/office/drawing/2010/main" xmlns:mv="urn:schemas-microsoft-com:mac:vml" xmlns:mo="http://schemas.microsoft.com/office/mac/office/2008/main">
+                            <a14:hiddenFill xmlns:mo="http://schemas.microsoft.com/office/mac/office/2008/main" xmlns:mv="urn:schemas-microsoft-com:mac:vml" xmlns:a14="http://schemas.microsoft.com/office/drawing/2010/main" xmlns:w="http://schemas.openxmlformats.org/wordprocessingml/2006/main" xmlns:w10="urn:schemas-microsoft-com:office:word" xmlns:v="urn:schemas-microsoft-com:vml" xmlns:o="urn:schemas-microsoft-com:office:office" xmlns="">
                               <a:solidFill>
                                 <a:srgbClr val="FFFFFF"/>
                               </a:solidFill>
                             </a14:hiddenFill>
                           </a:ext>
                           <a:ext uri="{91240B29-F687-4f45-9708-019B960494DF}">
-                            <a14:hiddenLine xmlns="" xmlns:o="urn:schemas-microsoft-com:office:office" xmlns:v="urn:schemas-microsoft-com:vml" xmlns:w10="urn:schemas-microsoft-com:office:word" xmlns:w="http://schemas.openxmlformats.org/wordprocessingml/2006/main" xmlns:a14="http://schemas.microsoft.com/office/drawing/2010/main" xmlns:mv="urn:schemas-microsoft-com:mac:vml" xmlns:mo="http://schemas.microsoft.com/office/mac/office/2008/main" w="9525">
+                            <a14:hiddenLine xmlns:mo="http://schemas.microsoft.com/office/mac/office/2008/main" xmlns:mv="urn:schemas-microsoft-com:mac:vml" xmlns:a14="http://schemas.microsoft.com/office/drawing/2010/main" xmlns:w="http://schemas.openxmlformats.org/wordprocessingml/2006/main" xmlns:w10="urn:schemas-microsoft-com:office:word" xmlns:v="urn:schemas-microsoft-com:vml" xmlns:o="urn:schemas-microsoft-com:office:office" xmlns="" w="9525">
                               <a:solidFill>
                                 <a:srgbClr val="000000"/>
                               </a:solidFill>
@@ -514,14 +514,14 @@
                         </a:ln>
                         <a:extLst>
                           <a:ext uri="{909E8E84-426E-40dd-AFC4-6F175D3DCCD1}">
-                            <a14:hiddenFill xmlns="" xmlns:o="urn:schemas-microsoft-com:office:office" xmlns:v="urn:schemas-microsoft-com:vml" xmlns:w10="urn:schemas-microsoft-com:office:word" xmlns:w="http://schemas.openxmlformats.org/wordprocessingml/2006/main" xmlns:a14="http://schemas.microsoft.com/office/drawing/2010/main" xmlns:mv="urn:schemas-microsoft-com:mac:vml" xmlns:mo="http://schemas.microsoft.com/office/mac/office/2008/main">
+                            <a14:hiddenFill xmlns:mo="http://schemas.microsoft.com/office/mac/office/2008/main" xmlns:mv="urn:schemas-microsoft-com:mac:vml" xmlns:a14="http://schemas.microsoft.com/office/drawing/2010/main" xmlns:w="http://schemas.openxmlformats.org/wordprocessingml/2006/main" xmlns:w10="urn:schemas-microsoft-com:office:word" xmlns:v="urn:schemas-microsoft-com:vml" xmlns:o="urn:schemas-microsoft-com:office:office" xmlns="">
                               <a:solidFill>
                                 <a:srgbClr val="FFFFFF"/>
                               </a:solidFill>
                             </a14:hiddenFill>
                           </a:ext>
                           <a:ext uri="{91240B29-F687-4f45-9708-019B960494DF}">
-                            <a14:hiddenLine xmlns="" xmlns:o="urn:schemas-microsoft-com:office:office" xmlns:v="urn:schemas-microsoft-com:vml" xmlns:w10="urn:schemas-microsoft-com:office:word" xmlns:w="http://schemas.openxmlformats.org/wordprocessingml/2006/main" xmlns:a14="http://schemas.microsoft.com/office/drawing/2010/main" xmlns:mv="urn:schemas-microsoft-com:mac:vml" xmlns:mo="http://schemas.microsoft.com/office/mac/office/2008/main" w="9525">
+                            <a14:hiddenLine xmlns:mo="http://schemas.microsoft.com/office/mac/office/2008/main" xmlns:mv="urn:schemas-microsoft-com:mac:vml" xmlns:a14="http://schemas.microsoft.com/office/drawing/2010/main" xmlns:w="http://schemas.openxmlformats.org/wordprocessingml/2006/main" xmlns:w10="urn:schemas-microsoft-com:office:word" xmlns:v="urn:schemas-microsoft-com:vml" xmlns:o="urn:schemas-microsoft-com:office:office" xmlns="" w="9525">
                               <a:solidFill>
                                 <a:srgbClr val="000000"/>
                               </a:solidFill>
@@ -588,7 +588,7 @@
                                 <w:sz w:val="36"/>
                                 <w:szCs w:val="36"/>
                               </w:rPr>
-                              <w:t>9</w:t>
+                              <w:t>10</w:t>
                             </w:r>
                             <w:r>
                               <w:rPr>
@@ -604,7 +604,23 @@
                                 <w:sz w:val="36"/>
                                 <w:szCs w:val="36"/>
                               </w:rPr>
-                              <w:t>11/11</w:t>
+                              <w:t>1</w:t>
+                            </w:r>
+                            <w:r>
+                              <w:rPr>
+                                <w:rFonts w:cstheme="minorHAnsi"/>
+                                <w:sz w:val="36"/>
+                                <w:szCs w:val="36"/>
+                              </w:rPr>
+                              <w:t>2</w:t>
+                            </w:r>
+                            <w:r>
+                              <w:rPr>
+                                <w:rFonts w:cstheme="minorHAnsi"/>
+                                <w:sz w:val="36"/>
+                                <w:szCs w:val="36"/>
+                              </w:rPr>
+                              <w:t>/11</w:t>
                             </w:r>
                             <w:r>
                               <w:rPr>
@@ -634,7 +650,11 @@
           </mc:Choice>
           <mc:Fallback>
             <w:pict>
-              <v:shape w14:anchorId="28027B79" id="Text Box 4" o:spid="_x0000_s1028" type="#_x0000_t202" style="position:absolute;margin-left:9pt;margin-top:306pt;width:6in;height:117pt;z-index:251616256;visibility:visible;mso-wrap-style:square;mso-width-percent:0;mso-height-percent:0;mso-wrap-distance-left:9pt;mso-wrap-distance-top:0;mso-wrap-distance-right:9pt;mso-wrap-distance-bottom:0;mso-position-horizontal:absolute;mso-position-horizontal-relative:text;mso-position-vertical:absolute;mso-position-vertical-relative:text;mso-width-percent:0;mso-height-percent:0;mso-width-relative:page;mso-height-relative:page;v-text-anchor:top" o:gfxdata="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" filled="f" stroked="f">
+              <v:shapetype w14:anchorId="28027B79" id="_x0000_t202" coordsize="21600,21600" o:spt="202" path="m,l,21600r21600,l21600,xe">
+                <v:stroke joinstyle="miter"/>
+                <v:path gradientshapeok="t" o:connecttype="rect"/>
+              </v:shapetype>
+              <v:shape id="Text Box 4" o:spid="_x0000_s1028" type="#_x0000_t202" style="position:absolute;margin-left:9pt;margin-top:306pt;width:6in;height:117pt;z-index:251616256;visibility:visible;mso-wrap-style:square;mso-width-percent:0;mso-height-percent:0;mso-wrap-distance-left:9pt;mso-wrap-distance-top:0;mso-wrap-distance-right:9pt;mso-wrap-distance-bottom:0;mso-position-horizontal:absolute;mso-position-horizontal-relative:text;mso-position-vertical:absolute;mso-position-vertical-relative:text;mso-width-percent:0;mso-height-percent:0;mso-width-relative:page;mso-height-relative:page;v-text-anchor:top" o:gfxdata="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" filled="f" stroked="f">
                 <v:textbox inset=",7.2pt,,7.2pt">
                   <w:txbxContent>
                     <w:p>
@@ -691,7 +711,7 @@
                           <w:sz w:val="36"/>
                           <w:szCs w:val="36"/>
                         </w:rPr>
-                        <w:t>9</w:t>
+                        <w:t>10</w:t>
                       </w:r>
                       <w:r>
                         <w:rPr>
@@ -707,7 +727,23 @@
                           <w:sz w:val="36"/>
                           <w:szCs w:val="36"/>
                         </w:rPr>
-                        <w:t>11/11</w:t>
+                        <w:t>1</w:t>
+                      </w:r>
+                      <w:r>
+                        <w:rPr>
+                          <w:rFonts w:cstheme="minorHAnsi"/>
+                          <w:sz w:val="36"/>
+                          <w:szCs w:val="36"/>
+                        </w:rPr>
+                        <w:t>2</w:t>
+                      </w:r>
+                      <w:r>
+                        <w:rPr>
+                          <w:rFonts w:cstheme="minorHAnsi"/>
+                          <w:sz w:val="36"/>
+                          <w:szCs w:val="36"/>
+                        </w:rPr>
+                        <w:t>/11</w:t>
                       </w:r>
                       <w:r>
                         <w:rPr>
@@ -792,7 +828,7 @@
                         </a:effectLst>
                         <a:extLst>
                           <a:ext uri="{909E8E84-426E-40dd-AFC4-6F175D3DCCD1}">
-                            <a14:hiddenFill xmlns="" xmlns:o="urn:schemas-microsoft-com:office:office" xmlns:v="urn:schemas-microsoft-com:vml" xmlns:w10="urn:schemas-microsoft-com:office:word" xmlns:w="http://schemas.openxmlformats.org/wordprocessingml/2006/main" xmlns:a14="http://schemas.microsoft.com/office/drawing/2010/main" xmlns:mv="urn:schemas-microsoft-com:mac:vml" xmlns:mo="http://schemas.microsoft.com/office/mac/office/2008/main">
+                            <a14:hiddenFill xmlns:mo="http://schemas.microsoft.com/office/mac/office/2008/main" xmlns:mv="urn:schemas-microsoft-com:mac:vml" xmlns:a14="http://schemas.microsoft.com/office/drawing/2010/main" xmlns:w="http://schemas.openxmlformats.org/wordprocessingml/2006/main" xmlns:w10="urn:schemas-microsoft-com:office:word" xmlns:v="urn:schemas-microsoft-com:vml" xmlns:o="urn:schemas-microsoft-com:office:office" xmlns="">
                               <a:noFill/>
                             </a14:hiddenFill>
                           </a:ext>
@@ -874,14 +910,14 @@
                         </a:ln>
                         <a:extLst>
                           <a:ext uri="{909E8E84-426E-40dd-AFC4-6F175D3DCCD1}">
-                            <a14:hiddenFill xmlns="" xmlns:o="urn:schemas-microsoft-com:office:office" xmlns:v="urn:schemas-microsoft-com:vml" xmlns:w10="urn:schemas-microsoft-com:office:word" xmlns:w="http://schemas.openxmlformats.org/wordprocessingml/2006/main" xmlns:a14="http://schemas.microsoft.com/office/drawing/2010/main" xmlns:mv="urn:schemas-microsoft-com:mac:vml" xmlns:mo="http://schemas.microsoft.com/office/mac/office/2008/main">
+                            <a14:hiddenFill xmlns:mo="http://schemas.microsoft.com/office/mac/office/2008/main" xmlns:mv="urn:schemas-microsoft-com:mac:vml" xmlns:a14="http://schemas.microsoft.com/office/drawing/2010/main" xmlns:w="http://schemas.openxmlformats.org/wordprocessingml/2006/main" xmlns:w10="urn:schemas-microsoft-com:office:word" xmlns:v="urn:schemas-microsoft-com:vml" xmlns:o="urn:schemas-microsoft-com:office:office" xmlns="">
                               <a:solidFill>
                                 <a:srgbClr val="FFFFFF"/>
                               </a:solidFill>
                             </a14:hiddenFill>
                           </a:ext>
                           <a:ext uri="{91240B29-F687-4f45-9708-019B960494DF}">
-                            <a14:hiddenLine xmlns="" xmlns:o="urn:schemas-microsoft-com:office:office" xmlns:v="urn:schemas-microsoft-com:vml" xmlns:w10="urn:schemas-microsoft-com:office:word" xmlns:w="http://schemas.openxmlformats.org/wordprocessingml/2006/main" xmlns:a14="http://schemas.microsoft.com/office/drawing/2010/main" xmlns:mv="urn:schemas-microsoft-com:mac:vml" xmlns:mo="http://schemas.microsoft.com/office/mac/office/2008/main" w="9525">
+                            <a14:hiddenLine xmlns:mo="http://schemas.microsoft.com/office/mac/office/2008/main" xmlns:mv="urn:schemas-microsoft-com:mac:vml" xmlns:a14="http://schemas.microsoft.com/office/drawing/2010/main" xmlns:w="http://schemas.openxmlformats.org/wordprocessingml/2006/main" xmlns:w10="urn:schemas-microsoft-com:office:word" xmlns:v="urn:schemas-microsoft-com:vml" xmlns:o="urn:schemas-microsoft-com:office:office" xmlns="" w="9525">
                               <a:solidFill>
                                 <a:srgbClr val="000000"/>
                               </a:solidFill>
@@ -1922,6 +1958,92 @@
           </w:p>
         </w:tc>
       </w:tr>
+      <w:tr>
+        <w:tc>
+          <w:tcPr>
+            <w:tcW w:w="2335" w:type="dxa"/>
+          </w:tcPr>
+          <w:p>
+            <w:pPr>
+              <w:ind w:firstLine="0"/>
+              <w:jc w:val="center"/>
+              <w:rPr>
+                <w:lang w:eastAsia="en-US"/>
+              </w:rPr>
+            </w:pPr>
+            <w:r>
+              <w:rPr>
+                <w:lang w:eastAsia="en-US"/>
+              </w:rPr>
+              <w:t>V0.10</w:t>
+            </w:r>
+          </w:p>
+        </w:tc>
+        <w:tc>
+          <w:tcPr>
+            <w:tcW w:w="1800" w:type="dxa"/>
+          </w:tcPr>
+          <w:p>
+            <w:pPr>
+              <w:ind w:firstLine="0"/>
+              <w:jc w:val="center"/>
+              <w:rPr>
+                <w:lang w:eastAsia="en-US"/>
+              </w:rPr>
+            </w:pPr>
+            <w:r>
+              <w:rPr>
+                <w:lang w:eastAsia="en-US"/>
+              </w:rPr>
+              <w:t>12/4/2024</w:t>
+            </w:r>
+          </w:p>
+        </w:tc>
+        <w:tc>
+          <w:tcPr>
+            <w:tcW w:w="4869" w:type="dxa"/>
+          </w:tcPr>
+          <w:p>
+            <w:pPr>
+              <w:ind w:firstLine="0"/>
+              <w:jc w:val="left"/>
+              <w:rPr>
+                <w:lang w:eastAsia="en-US"/>
+              </w:rPr>
+            </w:pPr>
+            <w:r>
+              <w:rPr>
+                <w:lang w:eastAsia="en-US"/>
+              </w:rPr>
+              <w:t xml:space="preserve">Reduced anticipated zone detection and alerting to only horizontal </w:t>
+            </w:r>
+            <w:r>
+              <w:rPr>
+                <w:lang w:eastAsia="en-US"/>
+              </w:rPr>
+              <w:t>plane</w:t>
+            </w:r>
+            <w:r>
+              <w:rPr>
+                <w:lang w:eastAsia="en-US"/>
+              </w:rPr>
+              <w:t xml:space="preserve"> projection of </w:t>
+            </w:r>
+            <w:r>
+              <w:rPr>
+                <w:lang w:eastAsia="en-US"/>
+              </w:rPr>
+              <w:t xml:space="preserve">declared </w:t>
+            </w:r>
+            <w:r>
+              <w:rPr>
+                <w:lang w:eastAsia="en-US"/>
+              </w:rPr>
+              <w:t>zones.</w:t>
+            </w:r>
+          </w:p>
+        </w:tc>
+      </w:tr>
     </w:tbl>
     <w:p>
       <w:pPr>
@@ -2040,7 +2162,7 @@
         <w:rPr>
           <w:noProof/>
         </w:rPr>
-        <w:instrText xml:space="preserve"> PAGEREF _Toc182310360 \h </w:instrText>
+        <w:instrText xml:space="preserve"> PAGEREF _Toc184219163 \h </w:instrText>
       </w:r>
       <w:r>
         <w:rPr>
@@ -2119,7 +2241,7 @@
         <w:rPr>
           <w:noProof/>
         </w:rPr>
-        <w:instrText xml:space="preserve"> PAGEREF _Toc182310361 \h </w:instrText>
+        <w:instrText xml:space="preserve"> PAGEREF _Toc184219164 \h </w:instrText>
       </w:r>
       <w:r>
         <w:rPr>
@@ -2202,7 +2324,7 @@
         <w:rPr>
           <w:noProof/>
         </w:rPr>
-        <w:instrText xml:space="preserve"> PAGEREF _Toc182310362 \h </w:instrText>
+        <w:instrText xml:space="preserve"> PAGEREF _Toc184219165 \h </w:instrText>
       </w:r>
       <w:r>
         <w:rPr>
@@ -2285,7 +2407,7 @@
         <w:rPr>
           <w:noProof/>
         </w:rPr>
-        <w:instrText xml:space="preserve"> PAGEREF _Toc182310363 \h </w:instrText>
+        <w:instrText xml:space="preserve"> PAGEREF _Toc184219166 \h </w:instrText>
       </w:r>
       <w:r>
         <w:rPr>
@@ -2368,7 +2490,7 @@
         <w:rPr>
           <w:noProof/>
         </w:rPr>
-        <w:instrText xml:space="preserve"> PAGEREF _Toc182310364 \h </w:instrText>
+        <w:instrText xml:space="preserve"> PAGEREF _Toc184219167 \h </w:instrText>
       </w:r>
       <w:r>
         <w:rPr>
@@ -2451,7 +2573,7 @@
         <w:rPr>
           <w:noProof/>
         </w:rPr>
-        <w:instrText xml:space="preserve"> PAGEREF _Toc182310365 \h </w:instrText>
+        <w:instrText xml:space="preserve"> PAGEREF _Toc184219168 \h </w:instrText>
       </w:r>
       <w:r>
         <w:rPr>
@@ -2534,7 +2656,7 @@
         <w:rPr>
           <w:noProof/>
         </w:rPr>
-        <w:instrText xml:space="preserve"> PAGEREF _Toc182310366 \h </w:instrText>
+        <w:instrText xml:space="preserve"> PAGEREF _Toc184219169 \h </w:instrText>
       </w:r>
       <w:r>
         <w:rPr>
@@ -2551,7 +2673,7 @@
         <w:rPr>
           <w:noProof/>
         </w:rPr>
-        <w:t>2</w:t>
+        <w:t>3</w:t>
       </w:r>
       <w:r>
         <w:rPr>
@@ -2613,7 +2735,7 @@
         <w:rPr>
           <w:noProof/>
         </w:rPr>
-        <w:instrText xml:space="preserve"> PAGEREF _Toc182310367 \h </w:instrText>
+        <w:instrText xml:space="preserve"> PAGEREF _Toc184219170 \h </w:instrText>
       </w:r>
       <w:r>
         <w:rPr>
@@ -2696,7 +2818,7 @@
         <w:rPr>
           <w:noProof/>
         </w:rPr>
-        <w:instrText xml:space="preserve"> PAGEREF _Toc182310368 \h </w:instrText>
+        <w:instrText xml:space="preserve"> PAGEREF _Toc184219171 \h </w:instrText>
       </w:r>
       <w:r>
         <w:rPr>
@@ -2779,7 +2901,7 @@
         <w:rPr>
           <w:noProof/>
         </w:rPr>
-        <w:instrText xml:space="preserve"> PAGEREF _Toc182310369 \h </w:instrText>
+        <w:instrText xml:space="preserve"> PAGEREF _Toc184219172 \h </w:instrText>
       </w:r>
       <w:r>
         <w:rPr>
@@ -2862,7 +2984,7 @@
         <w:rPr>
           <w:noProof/>
         </w:rPr>
-        <w:instrText xml:space="preserve"> PAGEREF _Toc182310370 \h </w:instrText>
+        <w:instrText xml:space="preserve"> PAGEREF _Toc184219173 \h </w:instrText>
       </w:r>
       <w:r>
         <w:rPr>
@@ -2927,7 +3049,7 @@
           <w:rFonts w:eastAsiaTheme="minorEastAsia"/>
           <w:noProof/>
         </w:rPr>
-        <w:t>Existing Zone Violation Alerting</w:t>
+        <w:t>Existing Zone Projection Violation Alerting</w:t>
       </w:r>
       <w:r>
         <w:rPr>
@@ -2945,7 +3067,7 @@
         <w:rPr>
           <w:noProof/>
         </w:rPr>
-        <w:instrText xml:space="preserve"> PAGEREF _Toc182310371 \h </w:instrText>
+        <w:instrText xml:space="preserve"> PAGEREF _Toc184219174 \h </w:instrText>
       </w:r>
       <w:r>
         <w:rPr>
@@ -2962,7 +3084,7 @@
         <w:rPr>
           <w:noProof/>
         </w:rPr>
-        <w:t>4</w:t>
+        <w:t>5</w:t>
       </w:r>
       <w:r>
         <w:rPr>
@@ -3010,7 +3132,7 @@
           <w:rFonts w:eastAsiaTheme="minorEastAsia"/>
           <w:noProof/>
         </w:rPr>
-        <w:t>Imminent Zone Violation Alerting</w:t>
+        <w:t>Imminent Zone Projection Violation Alerting</w:t>
       </w:r>
       <w:r>
         <w:rPr>
@@ -3028,7 +3150,7 @@
         <w:rPr>
           <w:noProof/>
         </w:rPr>
-        <w:instrText xml:space="preserve"> PAGEREF _Toc182310372 \h </w:instrText>
+        <w:instrText xml:space="preserve"> PAGEREF _Toc184219175 \h </w:instrText>
       </w:r>
       <w:r>
         <w:rPr>
@@ -3045,7 +3167,7 @@
         <w:rPr>
           <w:noProof/>
         </w:rPr>
-        <w:t>4</w:t>
+        <w:t>5</w:t>
       </w:r>
       <w:r>
         <w:rPr>
@@ -3111,7 +3233,7 @@
         <w:rPr>
           <w:noProof/>
         </w:rPr>
-        <w:instrText xml:space="preserve"> PAGEREF _Toc182310373 \h </w:instrText>
+        <w:instrText xml:space="preserve"> PAGEREF _Toc184219176 \h </w:instrText>
       </w:r>
       <w:r>
         <w:rPr>
@@ -3128,7 +3250,7 @@
         <w:rPr>
           <w:noProof/>
         </w:rPr>
-        <w:t>5</w:t>
+        <w:t>6</w:t>
       </w:r>
       <w:r>
         <w:rPr>
@@ -3190,7 +3312,7 @@
         <w:rPr>
           <w:noProof/>
         </w:rPr>
-        <w:instrText xml:space="preserve"> PAGEREF _Toc182310374 \h </w:instrText>
+        <w:instrText xml:space="preserve"> PAGEREF _Toc184219177 \h </w:instrText>
       </w:r>
       <w:r>
         <w:rPr>
@@ -3207,7 +3329,924 @@
         <w:rPr>
           <w:noProof/>
         </w:rPr>
-        <w:t>5</w:t>
+        <w:t>6</w:t>
+      </w:r>
+      <w:r>
+        <w:rPr>
+          <w:noProof/>
+        </w:rPr>
+        <w:fldChar w:fldCharType="end"/>
+      </w:r>
+    </w:p>
+    <w:p>
+      <w:pPr>
+        <w:pStyle w:val="TOC2"/>
+        <w:tabs>
+          <w:tab w:val="left" w:pos="1200"/>
+          <w:tab w:val="right" w:leader="dot" w:pos="9004"/>
+        </w:tabs>
+        <w:rPr>
+          <w:rFonts w:eastAsiaTheme="minorEastAsia" w:cstheme="minorBidi"/>
+          <w:noProof/>
+          <w:kern w:val="2"/>
+          <w:szCs w:val="24"/>
+          <w:lang w:eastAsia="en-US"/>
+          <w14:ligatures w14:val="standardContextual"/>
+        </w:rPr>
+      </w:pPr>
+      <w:r>
+        <w:rPr>
+          <w:rFonts w:eastAsiaTheme="minorEastAsia"/>
+          <w:noProof/>
+        </w:rPr>
+        <w:t>4.1</w:t>
+      </w:r>
+      <w:r>
+        <w:rPr>
+          <w:rFonts w:eastAsiaTheme="minorEastAsia" w:cstheme="minorBidi"/>
+          <w:noProof/>
+          <w:kern w:val="2"/>
+          <w:szCs w:val="24"/>
+          <w:lang w:eastAsia="en-US"/>
+          <w14:ligatures w14:val="standardContextual"/>
+        </w:rPr>
+        <w:tab/>
+      </w:r>
+      <w:r>
+        <w:rPr>
+          <w:rFonts w:eastAsiaTheme="minorEastAsia"/>
+          <w:noProof/>
+        </w:rPr>
+        <w:t>Case 1. Report Violations at Vehicle State Time Regardless of Staleness</w:t>
+      </w:r>
+      <w:r>
+        <w:rPr>
+          <w:noProof/>
+        </w:rPr>
+        <w:tab/>
+      </w:r>
+      <w:r>
+        <w:rPr>
+          <w:noProof/>
+        </w:rPr>
+        <w:fldChar w:fldCharType="begin"/>
+      </w:r>
+      <w:r>
+        <w:rPr>
+          <w:noProof/>
+        </w:rPr>
+        <w:instrText xml:space="preserve"> PAGEREF _Toc184219178 \h </w:instrText>
+      </w:r>
+      <w:r>
+        <w:rPr>
+          <w:noProof/>
+        </w:rPr>
+      </w:r>
+      <w:r>
+        <w:rPr>
+          <w:noProof/>
+        </w:rPr>
+        <w:fldChar w:fldCharType="separate"/>
+      </w:r>
+      <w:r>
+        <w:rPr>
+          <w:noProof/>
+        </w:rPr>
+        <w:t>6</w:t>
+      </w:r>
+      <w:r>
+        <w:rPr>
+          <w:noProof/>
+        </w:rPr>
+        <w:fldChar w:fldCharType="end"/>
+      </w:r>
+    </w:p>
+    <w:p>
+      <w:pPr>
+        <w:pStyle w:val="TOC2"/>
+        <w:tabs>
+          <w:tab w:val="left" w:pos="1200"/>
+          <w:tab w:val="right" w:leader="dot" w:pos="9004"/>
+        </w:tabs>
+        <w:rPr>
+          <w:rFonts w:eastAsiaTheme="minorEastAsia" w:cstheme="minorBidi"/>
+          <w:noProof/>
+          <w:kern w:val="2"/>
+          <w:szCs w:val="24"/>
+          <w:lang w:eastAsia="en-US"/>
+          <w14:ligatures w14:val="standardContextual"/>
+        </w:rPr>
+      </w:pPr>
+      <w:r>
+        <w:rPr>
+          <w:rFonts w:eastAsiaTheme="minorEastAsia"/>
+          <w:noProof/>
+        </w:rPr>
+        <w:t>4.2</w:t>
+      </w:r>
+      <w:r>
+        <w:rPr>
+          <w:rFonts w:eastAsiaTheme="minorEastAsia" w:cstheme="minorBidi"/>
+          <w:noProof/>
+          <w:kern w:val="2"/>
+          <w:szCs w:val="24"/>
+          <w:lang w:eastAsia="en-US"/>
+          <w14:ligatures w14:val="standardContextual"/>
+        </w:rPr>
+        <w:tab/>
+      </w:r>
+      <w:r>
+        <w:rPr>
+          <w:rFonts w:eastAsiaTheme="minorEastAsia"/>
+          <w:noProof/>
+        </w:rPr>
+        <w:t>Case 2. Typical Existing Zone Violation Reporting</w:t>
+      </w:r>
+      <w:r>
+        <w:rPr>
+          <w:noProof/>
+        </w:rPr>
+        <w:tab/>
+      </w:r>
+      <w:r>
+        <w:rPr>
+          <w:noProof/>
+        </w:rPr>
+        <w:fldChar w:fldCharType="begin"/>
+      </w:r>
+      <w:r>
+        <w:rPr>
+          <w:noProof/>
+        </w:rPr>
+        <w:instrText xml:space="preserve"> PAGEREF _Toc184219179 \h </w:instrText>
+      </w:r>
+      <w:r>
+        <w:rPr>
+          <w:noProof/>
+        </w:rPr>
+      </w:r>
+      <w:r>
+        <w:rPr>
+          <w:noProof/>
+        </w:rPr>
+        <w:fldChar w:fldCharType="separate"/>
+      </w:r>
+      <w:r>
+        <w:rPr>
+          <w:noProof/>
+        </w:rPr>
+        <w:t>6</w:t>
+      </w:r>
+      <w:r>
+        <w:rPr>
+          <w:noProof/>
+        </w:rPr>
+        <w:fldChar w:fldCharType="end"/>
+      </w:r>
+    </w:p>
+    <w:p>
+      <w:pPr>
+        <w:pStyle w:val="TOC2"/>
+        <w:tabs>
+          <w:tab w:val="left" w:pos="1200"/>
+          <w:tab w:val="right" w:leader="dot" w:pos="9004"/>
+        </w:tabs>
+        <w:rPr>
+          <w:rFonts w:eastAsiaTheme="minorEastAsia" w:cstheme="minorBidi"/>
+          <w:noProof/>
+          <w:kern w:val="2"/>
+          <w:szCs w:val="24"/>
+          <w:lang w:eastAsia="en-US"/>
+          <w14:ligatures w14:val="standardContextual"/>
+        </w:rPr>
+      </w:pPr>
+      <w:r>
+        <w:rPr>
+          <w:rFonts w:eastAsiaTheme="minorEastAsia"/>
+          <w:noProof/>
+        </w:rPr>
+        <w:t>4.3</w:t>
+      </w:r>
+      <w:r>
+        <w:rPr>
+          <w:rFonts w:eastAsiaTheme="minorEastAsia" w:cstheme="minorBidi"/>
+          <w:noProof/>
+          <w:kern w:val="2"/>
+          <w:szCs w:val="24"/>
+          <w:lang w:eastAsia="en-US"/>
+          <w14:ligatures w14:val="standardContextual"/>
+        </w:rPr>
+        <w:tab/>
+      </w:r>
+      <w:r>
+        <w:rPr>
+          <w:rFonts w:eastAsiaTheme="minorEastAsia"/>
+          <w:noProof/>
+        </w:rPr>
+        <w:t>Case 3. Typical Imminent Zone Violation Reporting</w:t>
+      </w:r>
+      <w:r>
+        <w:rPr>
+          <w:noProof/>
+        </w:rPr>
+        <w:tab/>
+      </w:r>
+      <w:r>
+        <w:rPr>
+          <w:noProof/>
+        </w:rPr>
+        <w:fldChar w:fldCharType="begin"/>
+      </w:r>
+      <w:r>
+        <w:rPr>
+          <w:noProof/>
+        </w:rPr>
+        <w:instrText xml:space="preserve"> PAGEREF _Toc184219180 \h </w:instrText>
+      </w:r>
+      <w:r>
+        <w:rPr>
+          <w:noProof/>
+        </w:rPr>
+      </w:r>
+      <w:r>
+        <w:rPr>
+          <w:noProof/>
+        </w:rPr>
+        <w:fldChar w:fldCharType="separate"/>
+      </w:r>
+      <w:r>
+        <w:rPr>
+          <w:noProof/>
+        </w:rPr>
+        <w:t>7</w:t>
+      </w:r>
+      <w:r>
+        <w:rPr>
+          <w:noProof/>
+        </w:rPr>
+        <w:fldChar w:fldCharType="end"/>
+      </w:r>
+    </w:p>
+    <w:p>
+      <w:pPr>
+        <w:pStyle w:val="TOC2"/>
+        <w:tabs>
+          <w:tab w:val="left" w:pos="1200"/>
+          <w:tab w:val="right" w:leader="dot" w:pos="9004"/>
+        </w:tabs>
+        <w:rPr>
+          <w:rFonts w:eastAsiaTheme="minorEastAsia" w:cstheme="minorBidi"/>
+          <w:noProof/>
+          <w:kern w:val="2"/>
+          <w:szCs w:val="24"/>
+          <w:lang w:eastAsia="en-US"/>
+          <w14:ligatures w14:val="standardContextual"/>
+        </w:rPr>
+      </w:pPr>
+      <w:r>
+        <w:rPr>
+          <w:rFonts w:eastAsiaTheme="minorEastAsia"/>
+          <w:noProof/>
+        </w:rPr>
+        <w:t>4.4</w:t>
+      </w:r>
+      <w:r>
+        <w:rPr>
+          <w:rFonts w:eastAsiaTheme="minorEastAsia" w:cstheme="minorBidi"/>
+          <w:noProof/>
+          <w:kern w:val="2"/>
+          <w:szCs w:val="24"/>
+          <w:lang w:eastAsia="en-US"/>
+          <w14:ligatures w14:val="standardContextual"/>
+        </w:rPr>
+        <w:tab/>
+      </w:r>
+      <w:r>
+        <w:rPr>
+          <w:rFonts w:eastAsiaTheme="minorEastAsia"/>
+          <w:noProof/>
+        </w:rPr>
+        <w:t>Case 4: Not Reporting Past Imminent Projected Zone Violations</w:t>
+      </w:r>
+      <w:r>
+        <w:rPr>
+          <w:noProof/>
+        </w:rPr>
+        <w:tab/>
+      </w:r>
+      <w:r>
+        <w:rPr>
+          <w:noProof/>
+        </w:rPr>
+        <w:fldChar w:fldCharType="begin"/>
+      </w:r>
+      <w:r>
+        <w:rPr>
+          <w:noProof/>
+        </w:rPr>
+        <w:instrText xml:space="preserve"> PAGEREF _Toc184219181 \h </w:instrText>
+      </w:r>
+      <w:r>
+        <w:rPr>
+          <w:noProof/>
+        </w:rPr>
+      </w:r>
+      <w:r>
+        <w:rPr>
+          <w:noProof/>
+        </w:rPr>
+        <w:fldChar w:fldCharType="separate"/>
+      </w:r>
+      <w:r>
+        <w:rPr>
+          <w:noProof/>
+        </w:rPr>
+        <w:t>8</w:t>
+      </w:r>
+      <w:r>
+        <w:rPr>
+          <w:noProof/>
+        </w:rPr>
+        <w:fldChar w:fldCharType="end"/>
+      </w:r>
+    </w:p>
+    <w:p>
+      <w:pPr>
+        <w:pStyle w:val="TOC2"/>
+        <w:tabs>
+          <w:tab w:val="left" w:pos="1200"/>
+          <w:tab w:val="right" w:leader="dot" w:pos="9004"/>
+        </w:tabs>
+        <w:rPr>
+          <w:rFonts w:eastAsiaTheme="minorEastAsia" w:cstheme="minorBidi"/>
+          <w:noProof/>
+          <w:kern w:val="2"/>
+          <w:szCs w:val="24"/>
+          <w:lang w:eastAsia="en-US"/>
+          <w14:ligatures w14:val="standardContextual"/>
+        </w:rPr>
+      </w:pPr>
+      <w:r>
+        <w:rPr>
+          <w:noProof/>
+        </w:rPr>
+        <w:t>4.5</w:t>
+      </w:r>
+      <w:r>
+        <w:rPr>
+          <w:rFonts w:eastAsiaTheme="minorEastAsia" w:cstheme="minorBidi"/>
+          <w:noProof/>
+          <w:kern w:val="2"/>
+          <w:szCs w:val="24"/>
+          <w:lang w:eastAsia="en-US"/>
+          <w14:ligatures w14:val="standardContextual"/>
+        </w:rPr>
+        <w:tab/>
+      </w:r>
+      <w:r>
+        <w:rPr>
+          <w:noProof/>
+        </w:rPr>
+        <w:t>Case 5: Repeating Reports</w:t>
+      </w:r>
+      <w:r>
+        <w:rPr>
+          <w:noProof/>
+        </w:rPr>
+        <w:tab/>
+      </w:r>
+      <w:r>
+        <w:rPr>
+          <w:noProof/>
+        </w:rPr>
+        <w:fldChar w:fldCharType="begin"/>
+      </w:r>
+      <w:r>
+        <w:rPr>
+          <w:noProof/>
+        </w:rPr>
+        <w:instrText xml:space="preserve"> PAGEREF _Toc184219182 \h </w:instrText>
+      </w:r>
+      <w:r>
+        <w:rPr>
+          <w:noProof/>
+        </w:rPr>
+      </w:r>
+      <w:r>
+        <w:rPr>
+          <w:noProof/>
+        </w:rPr>
+        <w:fldChar w:fldCharType="separate"/>
+      </w:r>
+      <w:r>
+        <w:rPr>
+          <w:noProof/>
+        </w:rPr>
+        <w:t>8</w:t>
+      </w:r>
+      <w:r>
+        <w:rPr>
+          <w:noProof/>
+        </w:rPr>
+        <w:fldChar w:fldCharType="end"/>
+      </w:r>
+    </w:p>
+    <w:p>
+      <w:pPr>
+        <w:pStyle w:val="TOC2"/>
+        <w:tabs>
+          <w:tab w:val="left" w:pos="1200"/>
+          <w:tab w:val="right" w:leader="dot" w:pos="9004"/>
+        </w:tabs>
+        <w:rPr>
+          <w:rFonts w:eastAsiaTheme="minorEastAsia" w:cstheme="minorBidi"/>
+          <w:noProof/>
+          <w:kern w:val="2"/>
+          <w:szCs w:val="24"/>
+          <w:lang w:eastAsia="en-US"/>
+          <w14:ligatures w14:val="standardContextual"/>
+        </w:rPr>
+      </w:pPr>
+      <w:r>
+        <w:rPr>
+          <w:rFonts w:eastAsiaTheme="minorEastAsia"/>
+          <w:noProof/>
+        </w:rPr>
+        <w:t>4.6</w:t>
+      </w:r>
+      <w:r>
+        <w:rPr>
+          <w:rFonts w:eastAsiaTheme="minorEastAsia" w:cstheme="minorBidi"/>
+          <w:noProof/>
+          <w:kern w:val="2"/>
+          <w:szCs w:val="24"/>
+          <w:lang w:eastAsia="en-US"/>
+          <w14:ligatures w14:val="standardContextual"/>
+        </w:rPr>
+        <w:tab/>
+      </w:r>
+      <w:r>
+        <w:rPr>
+          <w:rFonts w:eastAsiaTheme="minorEastAsia"/>
+          <w:noProof/>
+        </w:rPr>
+        <w:t>Case 6. Rejected: Applying Route Information to Projected Violations</w:t>
+      </w:r>
+      <w:r>
+        <w:rPr>
+          <w:noProof/>
+        </w:rPr>
+        <w:tab/>
+      </w:r>
+      <w:r>
+        <w:rPr>
+          <w:noProof/>
+        </w:rPr>
+        <w:fldChar w:fldCharType="begin"/>
+      </w:r>
+      <w:r>
+        <w:rPr>
+          <w:noProof/>
+        </w:rPr>
+        <w:instrText xml:space="preserve"> PAGEREF _Toc184219183 \h </w:instrText>
+      </w:r>
+      <w:r>
+        <w:rPr>
+          <w:noProof/>
+        </w:rPr>
+      </w:r>
+      <w:r>
+        <w:rPr>
+          <w:noProof/>
+        </w:rPr>
+        <w:fldChar w:fldCharType="separate"/>
+      </w:r>
+      <w:r>
+        <w:rPr>
+          <w:noProof/>
+        </w:rPr>
+        <w:t>9</w:t>
+      </w:r>
+      <w:r>
+        <w:rPr>
+          <w:noProof/>
+        </w:rPr>
+        <w:fldChar w:fldCharType="end"/>
+      </w:r>
+    </w:p>
+    <w:p>
+      <w:pPr>
+        <w:pStyle w:val="TOC2"/>
+        <w:tabs>
+          <w:tab w:val="left" w:pos="1200"/>
+          <w:tab w:val="right" w:leader="dot" w:pos="9004"/>
+        </w:tabs>
+        <w:rPr>
+          <w:rFonts w:eastAsiaTheme="minorEastAsia" w:cstheme="minorBidi"/>
+          <w:noProof/>
+          <w:kern w:val="2"/>
+          <w:szCs w:val="24"/>
+          <w:lang w:eastAsia="en-US"/>
+          <w14:ligatures w14:val="standardContextual"/>
+        </w:rPr>
+      </w:pPr>
+      <w:r>
+        <w:rPr>
+          <w:rFonts w:eastAsiaTheme="minorEastAsia"/>
+          <w:noProof/>
+        </w:rPr>
+        <w:t>4.7</w:t>
+      </w:r>
+      <w:r>
+        <w:rPr>
+          <w:rFonts w:eastAsiaTheme="minorEastAsia" w:cstheme="minorBidi"/>
+          <w:noProof/>
+          <w:kern w:val="2"/>
+          <w:szCs w:val="24"/>
+          <w:lang w:eastAsia="en-US"/>
+          <w14:ligatures w14:val="standardContextual"/>
+        </w:rPr>
+        <w:tab/>
+      </w:r>
+      <w:r>
+        <w:rPr>
+          <w:rFonts w:eastAsiaTheme="minorEastAsia"/>
+          <w:noProof/>
+        </w:rPr>
+        <w:t>Case 7. Rejected. Reporting Violation at Present Time Rather than Reported Time</w:t>
+      </w:r>
+      <w:r>
+        <w:rPr>
+          <w:noProof/>
+        </w:rPr>
+        <w:tab/>
+      </w:r>
+      <w:r>
+        <w:rPr>
+          <w:noProof/>
+        </w:rPr>
+        <w:fldChar w:fldCharType="begin"/>
+      </w:r>
+      <w:r>
+        <w:rPr>
+          <w:noProof/>
+        </w:rPr>
+        <w:instrText xml:space="preserve"> PAGEREF _Toc184219184 \h </w:instrText>
+      </w:r>
+      <w:r>
+        <w:rPr>
+          <w:noProof/>
+        </w:rPr>
+      </w:r>
+      <w:r>
+        <w:rPr>
+          <w:noProof/>
+        </w:rPr>
+        <w:fldChar w:fldCharType="separate"/>
+      </w:r>
+      <w:r>
+        <w:rPr>
+          <w:noProof/>
+        </w:rPr>
+        <w:t>9</w:t>
+      </w:r>
+      <w:r>
+        <w:rPr>
+          <w:noProof/>
+        </w:rPr>
+        <w:fldChar w:fldCharType="end"/>
+      </w:r>
+    </w:p>
+    <w:p>
+      <w:pPr>
+        <w:pStyle w:val="TOC2"/>
+        <w:tabs>
+          <w:tab w:val="left" w:pos="1200"/>
+          <w:tab w:val="right" w:leader="dot" w:pos="9004"/>
+        </w:tabs>
+        <w:rPr>
+          <w:rFonts w:eastAsiaTheme="minorEastAsia" w:cstheme="minorBidi"/>
+          <w:noProof/>
+          <w:kern w:val="2"/>
+          <w:szCs w:val="24"/>
+          <w:lang w:eastAsia="en-US"/>
+          <w14:ligatures w14:val="standardContextual"/>
+        </w:rPr>
+      </w:pPr>
+      <w:r>
+        <w:rPr>
+          <w:rFonts w:eastAsiaTheme="minorEastAsia"/>
+          <w:noProof/>
+        </w:rPr>
+        <w:t>4.8</w:t>
+      </w:r>
+      <w:r>
+        <w:rPr>
+          <w:rFonts w:eastAsiaTheme="minorEastAsia" w:cstheme="minorBidi"/>
+          <w:noProof/>
+          <w:kern w:val="2"/>
+          <w:szCs w:val="24"/>
+          <w:lang w:eastAsia="en-US"/>
+          <w14:ligatures w14:val="standardContextual"/>
+        </w:rPr>
+        <w:tab/>
+      </w:r>
+      <w:r>
+        <w:rPr>
+          <w:rFonts w:eastAsiaTheme="minorEastAsia"/>
+          <w:noProof/>
+        </w:rPr>
+        <w:t>Case 8.  Ignoring Likely Violations that Occurred Between State Reports</w:t>
+      </w:r>
+      <w:r>
+        <w:rPr>
+          <w:noProof/>
+        </w:rPr>
+        <w:tab/>
+      </w:r>
+      <w:r>
+        <w:rPr>
+          <w:noProof/>
+        </w:rPr>
+        <w:fldChar w:fldCharType="begin"/>
+      </w:r>
+      <w:r>
+        <w:rPr>
+          <w:noProof/>
+        </w:rPr>
+        <w:instrText xml:space="preserve"> PAGEREF _Toc184219185 \h </w:instrText>
+      </w:r>
+      <w:r>
+        <w:rPr>
+          <w:noProof/>
+        </w:rPr>
+      </w:r>
+      <w:r>
+        <w:rPr>
+          <w:noProof/>
+        </w:rPr>
+        <w:fldChar w:fldCharType="separate"/>
+      </w:r>
+      <w:r>
+        <w:rPr>
+          <w:noProof/>
+        </w:rPr>
+        <w:t>9</w:t>
+      </w:r>
+      <w:r>
+        <w:rPr>
+          <w:noProof/>
+        </w:rPr>
+        <w:fldChar w:fldCharType="end"/>
+      </w:r>
+    </w:p>
+    <w:p>
+      <w:pPr>
+        <w:pStyle w:val="TOC2"/>
+        <w:tabs>
+          <w:tab w:val="left" w:pos="1200"/>
+          <w:tab w:val="right" w:leader="dot" w:pos="9004"/>
+        </w:tabs>
+        <w:rPr>
+          <w:rFonts w:eastAsiaTheme="minorEastAsia" w:cstheme="minorBidi"/>
+          <w:noProof/>
+          <w:kern w:val="2"/>
+          <w:szCs w:val="24"/>
+          <w:lang w:eastAsia="en-US"/>
+          <w14:ligatures w14:val="standardContextual"/>
+        </w:rPr>
+      </w:pPr>
+      <w:r>
+        <w:rPr>
+          <w:noProof/>
+          <w:lang w:eastAsia="en-US"/>
+        </w:rPr>
+        <w:t>4.9</w:t>
+      </w:r>
+      <w:r>
+        <w:rPr>
+          <w:rFonts w:eastAsiaTheme="minorEastAsia" w:cstheme="minorBidi"/>
+          <w:noProof/>
+          <w:kern w:val="2"/>
+          <w:szCs w:val="24"/>
+          <w:lang w:eastAsia="en-US"/>
+          <w14:ligatures w14:val="standardContextual"/>
+        </w:rPr>
+        <w:tab/>
+      </w:r>
+      <w:r>
+        <w:rPr>
+          <w:noProof/>
+          <w:lang w:eastAsia="en-US"/>
+        </w:rPr>
+        <w:t xml:space="preserve">Case 9: Boundary Skimming </w:t>
+      </w:r>
+      <w:r>
+        <w:rPr>
+          <w:noProof/>
+        </w:rPr>
+        <w:t>Behavior</w:t>
+      </w:r>
+      <w:r>
+        <w:rPr>
+          <w:noProof/>
+        </w:rPr>
+        <w:tab/>
+      </w:r>
+      <w:r>
+        <w:rPr>
+          <w:noProof/>
+        </w:rPr>
+        <w:fldChar w:fldCharType="begin"/>
+      </w:r>
+      <w:r>
+        <w:rPr>
+          <w:noProof/>
+        </w:rPr>
+        <w:instrText xml:space="preserve"> PAGEREF _Toc184219186 \h </w:instrText>
+      </w:r>
+      <w:r>
+        <w:rPr>
+          <w:noProof/>
+        </w:rPr>
+      </w:r>
+      <w:r>
+        <w:rPr>
+          <w:noProof/>
+        </w:rPr>
+        <w:fldChar w:fldCharType="separate"/>
+      </w:r>
+      <w:r>
+        <w:rPr>
+          <w:noProof/>
+        </w:rPr>
+        <w:t>10</w:t>
+      </w:r>
+      <w:r>
+        <w:rPr>
+          <w:noProof/>
+        </w:rPr>
+        <w:fldChar w:fldCharType="end"/>
+      </w:r>
+    </w:p>
+    <w:p>
+      <w:pPr>
+        <w:pStyle w:val="TOC2"/>
+        <w:tabs>
+          <w:tab w:val="left" w:pos="1400"/>
+          <w:tab w:val="right" w:leader="dot" w:pos="9004"/>
+        </w:tabs>
+        <w:rPr>
+          <w:rFonts w:eastAsiaTheme="minorEastAsia" w:cstheme="minorBidi"/>
+          <w:noProof/>
+          <w:kern w:val="2"/>
+          <w:szCs w:val="24"/>
+          <w:lang w:eastAsia="en-US"/>
+          <w14:ligatures w14:val="standardContextual"/>
+        </w:rPr>
+      </w:pPr>
+      <w:r>
+        <w:rPr>
+          <w:noProof/>
+          <w:lang w:eastAsia="en-US"/>
+        </w:rPr>
+        <w:t>4.10</w:t>
+      </w:r>
+      <w:r>
+        <w:rPr>
+          <w:rFonts w:eastAsiaTheme="minorEastAsia" w:cstheme="minorBidi"/>
+          <w:noProof/>
+          <w:kern w:val="2"/>
+          <w:szCs w:val="24"/>
+          <w:lang w:eastAsia="en-US"/>
+          <w14:ligatures w14:val="standardContextual"/>
+        </w:rPr>
+        <w:tab/>
+      </w:r>
+      <w:r>
+        <w:rPr>
+          <w:noProof/>
+          <w:lang w:eastAsia="en-US"/>
+        </w:rPr>
+        <w:t>Case 10: Rejected. Reports Failure to Be Able to Compute on Stale Vehicle Reports</w:t>
+      </w:r>
+      <w:r>
+        <w:rPr>
+          <w:noProof/>
+        </w:rPr>
+        <w:tab/>
+      </w:r>
+      <w:r>
+        <w:rPr>
+          <w:noProof/>
+        </w:rPr>
+        <w:fldChar w:fldCharType="begin"/>
+      </w:r>
+      <w:r>
+        <w:rPr>
+          <w:noProof/>
+        </w:rPr>
+        <w:instrText xml:space="preserve"> PAGEREF _Toc184219187 \h </w:instrText>
+      </w:r>
+      <w:r>
+        <w:rPr>
+          <w:noProof/>
+        </w:rPr>
+      </w:r>
+      <w:r>
+        <w:rPr>
+          <w:noProof/>
+        </w:rPr>
+        <w:fldChar w:fldCharType="separate"/>
+      </w:r>
+      <w:r>
+        <w:rPr>
+          <w:noProof/>
+        </w:rPr>
+        <w:t>10</w:t>
+      </w:r>
+      <w:r>
+        <w:rPr>
+          <w:noProof/>
+        </w:rPr>
+        <w:fldChar w:fldCharType="end"/>
+      </w:r>
+    </w:p>
+    <w:p>
+      <w:pPr>
+        <w:pStyle w:val="TOC2"/>
+        <w:tabs>
+          <w:tab w:val="left" w:pos="1400"/>
+          <w:tab w:val="right" w:leader="dot" w:pos="9004"/>
+        </w:tabs>
+        <w:rPr>
+          <w:rFonts w:eastAsiaTheme="minorEastAsia" w:cstheme="minorBidi"/>
+          <w:noProof/>
+          <w:kern w:val="2"/>
+          <w:szCs w:val="24"/>
+          <w:lang w:eastAsia="en-US"/>
+          <w14:ligatures w14:val="standardContextual"/>
+        </w:rPr>
+      </w:pPr>
+      <w:r>
+        <w:rPr>
+          <w:rFonts w:eastAsiaTheme="minorEastAsia"/>
+          <w:noProof/>
+        </w:rPr>
+        <w:t>4.11</w:t>
+      </w:r>
+      <w:r>
+        <w:rPr>
+          <w:rFonts w:eastAsiaTheme="minorEastAsia" w:cstheme="minorBidi"/>
+          <w:noProof/>
+          <w:kern w:val="2"/>
+          <w:szCs w:val="24"/>
+          <w:lang w:eastAsia="en-US"/>
+          <w14:ligatures w14:val="standardContextual"/>
+        </w:rPr>
+        <w:tab/>
+      </w:r>
+      <w:r>
+        <w:rPr>
+          <w:rFonts w:eastAsiaTheme="minorEastAsia"/>
+          <w:noProof/>
+        </w:rPr>
+        <w:t>Case 11: Rejected. Reporting only on Zones In Vehicle’s Assigned Operating Regions</w:t>
+      </w:r>
+      <w:r>
+        <w:rPr>
+          <w:noProof/>
+        </w:rPr>
+        <w:tab/>
+      </w:r>
+      <w:r>
+        <w:rPr>
+          <w:noProof/>
+        </w:rPr>
+        <w:fldChar w:fldCharType="begin"/>
+      </w:r>
+      <w:r>
+        <w:rPr>
+          <w:noProof/>
+        </w:rPr>
+        <w:instrText xml:space="preserve"> PAGEREF _Toc184219188 \h </w:instrText>
+      </w:r>
+      <w:r>
+        <w:rPr>
+          <w:noProof/>
+        </w:rPr>
+      </w:r>
+      <w:r>
+        <w:rPr>
+          <w:noProof/>
+        </w:rPr>
+        <w:fldChar w:fldCharType="separate"/>
+      </w:r>
+      <w:r>
+        <w:rPr>
+          <w:noProof/>
+        </w:rPr>
+        <w:t>10</w:t>
       </w:r>
       <w:r>
         <w:rPr>
@@ -3296,7 +4335,7 @@
           <w:rFonts w:eastAsiaTheme="minorEastAsia"/>
         </w:rPr>
       </w:pPr>
-      <w:bookmarkStart w:id="3" w:name="_Toc182310360"/>
+      <w:bookmarkStart w:id="3" w:name="_Toc184219163"/>
       <w:r>
         <w:rPr>
           <w:rFonts w:eastAsiaTheme="minorEastAsia"/>
@@ -3352,7 +4391,7 @@
           <w:lang w:eastAsia="en-US"/>
         </w:rPr>
       </w:pPr>
-      <w:bookmarkStart w:id="4" w:name="_Toc182310361"/>
+      <w:bookmarkStart w:id="4" w:name="_Toc184219164"/>
       <w:r>
         <w:rPr>
           <w:lang w:eastAsia="en-US"/>
@@ -3368,7 +4407,7 @@
           <w:lang w:eastAsia="en-US"/>
         </w:rPr>
       </w:pPr>
-      <w:bookmarkStart w:id="5" w:name="_Toc182310362"/>
+      <w:bookmarkStart w:id="5" w:name="_Toc184219165"/>
       <w:r>
         <w:rPr>
           <w:lang w:eastAsia="en-US"/>
@@ -3501,22 +4540,192 @@
     </w:p>
     <w:p>
       <w:pPr>
-        <w:pStyle w:val="NormalNoIndent"/>
+        <w:rPr>
+          <w:lang w:eastAsia="en-US"/>
+        </w:rPr>
       </w:pPr>
     </w:p>
     <w:p>
       <w:pPr>
+        <w:rPr>
+          <w:lang w:eastAsia="en-US"/>
+        </w:rPr>
+      </w:pPr>
+    </w:p>
+    <w:p>
+      <w:pPr>
+        <w:pStyle w:val="Heading3"/>
+        <w:rPr>
+          <w:lang w:eastAsia="en-US"/>
+        </w:rPr>
+      </w:pPr>
+      <w:r>
+        <w:rPr>
+          <w:lang w:eastAsia="en-US"/>
+        </w:rPr>
+        <w:lastRenderedPageBreak/>
+        <w:t>Zone</w:t>
+      </w:r>
+      <w:r>
+        <w:rPr>
+          <w:lang w:eastAsia="en-US"/>
+        </w:rPr>
+        <w:t xml:space="preserve"> Projection</w:t>
+      </w:r>
+    </w:p>
+    <w:p>
+      <w:pPr>
+        <w:pStyle w:val="Heading3"/>
+        <w:rPr>
+          <w:i w:val="0"/>
+          <w:iCs/>
+          <w:lang w:eastAsia="en-US"/>
+        </w:rPr>
+      </w:pPr>
+      <w:r>
+        <w:rPr>
+          <w:i w:val="0"/>
+          <w:iCs/>
+          <w:lang w:eastAsia="en-US"/>
+        </w:rPr>
+        <w:t xml:space="preserve">A zone projection is projection of a zone onto the </w:t>
+      </w:r>
+      <w:r>
+        <w:rPr>
+          <w:i w:val="0"/>
+          <w:iCs/>
+          <w:lang w:eastAsia="en-US"/>
+        </w:rPr>
+        <w:t xml:space="preserve">horizontal (iso-sea-level-altitude) </w:t>
+      </w:r>
+      <w:r>
+        <w:rPr>
+          <w:i w:val="0"/>
+          <w:iCs/>
+          <w:lang w:eastAsia="en-US"/>
+        </w:rPr>
+        <w:t xml:space="preserve"> plane</w:t>
+      </w:r>
+      <w:r>
+        <w:rPr>
+          <w:i w:val="0"/>
+          <w:iCs/>
+          <w:lang w:eastAsia="en-US"/>
+        </w:rPr>
+        <w:t>.</w:t>
+      </w:r>
+    </w:p>
+    <w:p>
+      <w:pPr>
+        <w:pStyle w:val="Heading3"/>
+        <w:rPr>
+          <w:lang w:eastAsia="en-US"/>
+        </w:rPr>
+      </w:pPr>
+      <w:r>
+        <w:rPr>
+          <w:lang w:eastAsia="en-US"/>
+        </w:rPr>
+        <w:t>Zone Projection</w:t>
+      </w:r>
+      <w:r>
+        <w:rPr>
+          <w:lang w:eastAsia="en-US"/>
+        </w:rPr>
+        <w:t xml:space="preserve"> </w:t>
+      </w:r>
+      <w:r>
+        <w:rPr>
+          <w:lang w:eastAsia="en-US"/>
+        </w:rPr>
+        <w:t>Violation</w:t>
+      </w:r>
+    </w:p>
+    <w:p>
+      <w:pPr>
+        <w:ind w:firstLine="0"/>
+        <w:rPr>
+          <w:lang w:eastAsia="en-US"/>
+        </w:rPr>
+      </w:pPr>
+      <w:r>
+        <w:rPr>
+          <w:lang w:eastAsia="en-US"/>
+        </w:rPr>
+        <w:t xml:space="preserve">A zone projection violation is violation of </w:t>
+      </w:r>
+      <w:r>
+        <w:rPr>
+          <w:lang w:eastAsia="en-US"/>
+        </w:rPr>
+        <w:t xml:space="preserve">the projection of a zone on the </w:t>
+      </w:r>
+      <w:r>
+        <w:rPr>
+          <w:lang w:eastAsia="en-US"/>
+        </w:rPr>
+        <w:t>horizontal</w:t>
+      </w:r>
+      <w:r>
+        <w:rPr>
+          <w:lang w:eastAsia="en-US"/>
+        </w:rPr>
+        <w:t xml:space="preserve"> </w:t>
+      </w:r>
+      <w:r>
+        <w:rPr>
+          <w:lang w:eastAsia="en-US"/>
+        </w:rPr>
+        <w:t xml:space="preserve">(iso-sea-level-altitude) </w:t>
+      </w:r>
+      <w:r>
+        <w:rPr>
+          <w:lang w:eastAsia="en-US"/>
+        </w:rPr>
+        <w:t xml:space="preserve">plane by the </w:t>
+      </w:r>
+      <w:r>
+        <w:rPr>
+          <w:lang w:eastAsia="en-US"/>
+        </w:rPr>
+        <w:t xml:space="preserve">projection of a vehicle position on the </w:t>
+      </w:r>
+      <w:r>
+        <w:rPr>
+          <w:lang w:eastAsia="en-US"/>
+        </w:rPr>
+        <w:t>horizontal</w:t>
+      </w:r>
+      <w:r>
+        <w:rPr>
+          <w:lang w:eastAsia="en-US"/>
+        </w:rPr>
+        <w:t xml:space="preserve"> plane.</w:t>
+      </w:r>
+      <w:r>
+        <w:rPr>
+          <w:lang w:eastAsia="en-US"/>
+        </w:rPr>
+        <w:t xml:space="preserve"> </w:t>
+      </w:r>
+    </w:p>
+    <w:p>
+      <w:pPr>
+        <w:pStyle w:val="NormalNoIndent"/>
+      </w:pPr>
+    </w:p>
+    <w:p>
+      <w:pPr>
         <w:pStyle w:val="Heading2Num"/>
         <w:rPr>
           <w:lang w:eastAsia="en-US"/>
         </w:rPr>
       </w:pPr>
-      <w:bookmarkStart w:id="6" w:name="_Toc182310363"/>
-      <w:r>
-        <w:rPr>
-          <w:lang w:eastAsia="en-US"/>
-        </w:rPr>
-        <w:lastRenderedPageBreak/>
+      <w:bookmarkStart w:id="6" w:name="_Toc184219166"/>
+      <w:r>
+        <w:rPr>
+          <w:lang w:eastAsia="en-US"/>
+        </w:rPr>
         <w:t>Motivation/Purpose (Problem Statement)</w:t>
       </w:r>
       <w:bookmarkEnd w:id="6"/>
@@ -3628,7 +4837,7 @@
           <w:lang w:eastAsia="en-US"/>
         </w:rPr>
       </w:pPr>
-      <w:bookmarkStart w:id="7" w:name="_Toc182310364"/>
+      <w:bookmarkStart w:id="7" w:name="_Toc184219167"/>
       <w:r>
         <w:rPr>
           <w:lang w:eastAsia="en-US"/>
@@ -3728,21 +4937,7 @@
         <w:rPr>
           <w:lang w:eastAsia="en-US"/>
         </w:rPr>
-        <w:t xml:space="preserve">Each OpenUxAS vehicle attempts to </w:t>
-      </w:r>
-      <w:proofErr w:type="gramStart"/>
-      <w:r>
-        <w:rPr>
-          <w:lang w:eastAsia="en-US"/>
-        </w:rPr>
-        <w:t>stay out of all keep-out zones at all times</w:t>
-      </w:r>
-      <w:proofErr w:type="gramEnd"/>
-      <w:r>
-        <w:rPr>
-          <w:lang w:eastAsia="en-US"/>
-        </w:rPr>
-        <w:t xml:space="preserve">. </w:t>
+        <w:t xml:space="preserve">Each OpenUxAS vehicle attempts to stay out of all keep-out zones at all times. </w:t>
       </w:r>
     </w:p>
     <w:p>
@@ -3760,21 +4955,7 @@
         <w:rPr>
           <w:lang w:eastAsia="en-US"/>
         </w:rPr>
-        <w:t xml:space="preserve">Each OpenUxAS vehicle attempts to </w:t>
-      </w:r>
-      <w:proofErr w:type="gramStart"/>
-      <w:r>
-        <w:rPr>
-          <w:lang w:eastAsia="en-US"/>
-        </w:rPr>
-        <w:t>stay inside at least one keep-in zone at all times</w:t>
-      </w:r>
-      <w:proofErr w:type="gramEnd"/>
-      <w:r>
-        <w:rPr>
-          <w:lang w:eastAsia="en-US"/>
-        </w:rPr>
-        <w:t>.</w:t>
+        <w:t>Each OpenUxAS vehicle attempts to stay inside at least one keep-in zone at all times.</w:t>
       </w:r>
     </w:p>
     <w:p>
@@ -3814,7 +4995,37 @@
         <w:rPr>
           <w:lang w:eastAsia="en-US"/>
         </w:rPr>
-        <w:t>A vehicle’s latest state report is in violation of a zone</w:t>
+        <w:t xml:space="preserve">A vehicle’s latest state report is in violation of a </w:t>
+      </w:r>
+      <w:r>
+        <w:rPr>
+          <w:lang w:eastAsia="en-US"/>
+        </w:rPr>
+        <w:t xml:space="preserve">zone </w:t>
+      </w:r>
+      <w:r>
+        <w:rPr>
+          <w:lang w:eastAsia="en-US"/>
+        </w:rPr>
+        <w:t>projected</w:t>
+      </w:r>
+      <w:r>
+        <w:rPr>
+          <w:lang w:eastAsia="en-US"/>
+        </w:rPr>
+        <w:t xml:space="preserve"> on the </w:t>
+      </w:r>
+      <w:r>
+        <w:rPr>
+          <w:lang w:eastAsia="en-US"/>
+        </w:rPr>
+        <w:t>horizontal</w:t>
+      </w:r>
+      <w:r>
+        <w:rPr>
+          <w:lang w:eastAsia="en-US"/>
+        </w:rPr>
+        <w:t xml:space="preserve"> plane.</w:t>
       </w:r>
     </w:p>
     <w:p>
@@ -3860,16 +5071,14 @@
         <w:rPr>
           <w:lang w:eastAsia="en-US"/>
         </w:rPr>
-        <w:t xml:space="preserve"> zone </w:t>
-      </w:r>
-      <w:proofErr w:type="gramStart"/>
-      <w:r>
-        <w:rPr>
-          <w:lang w:eastAsia="en-US"/>
-        </w:rPr>
-        <w:t>in the near future</w:t>
-      </w:r>
-      <w:proofErr w:type="gramEnd"/>
+        <w:t xml:space="preserve"> </w:t>
+      </w:r>
+      <w:r>
+        <w:rPr>
+          <w:lang w:eastAsia="en-US"/>
+        </w:rPr>
+        <w:t>zone projected in the horizontal plane</w:t>
+      </w:r>
       <w:r>
         <w:rPr>
           <w:lang w:eastAsia="en-US"/>
@@ -3884,7 +5093,7 @@
           <w:lang w:eastAsia="en-US"/>
         </w:rPr>
       </w:pPr>
-      <w:bookmarkStart w:id="8" w:name="_Toc182310365"/>
+      <w:bookmarkStart w:id="8" w:name="_Toc184219168"/>
       <w:r>
         <w:rPr>
           <w:lang w:eastAsia="en-US"/>
@@ -3958,7 +5167,7 @@
           <w:lang w:eastAsia="en-US"/>
         </w:rPr>
       </w:pPr>
-      <w:bookmarkStart w:id="9" w:name="_Toc182310366"/>
+      <w:bookmarkStart w:id="9" w:name="_Toc184219169"/>
       <w:r>
         <w:rPr>
           <w:lang w:eastAsia="en-US"/>
@@ -3982,12 +5191,11 @@
           <w:rFonts w:eastAsiaTheme="minorEastAsia"/>
         </w:rPr>
       </w:pPr>
-      <w:bookmarkStart w:id="10" w:name="_Toc182310367"/>
-      <w:r>
-        <w:rPr>
-          <w:rFonts w:eastAsiaTheme="minorEastAsia"/>
-        </w:rPr>
-        <w:lastRenderedPageBreak/>
+      <w:bookmarkStart w:id="10" w:name="_Toc184219170"/>
+      <w:r>
+        <w:rPr>
+          <w:rFonts w:eastAsiaTheme="minorEastAsia"/>
+        </w:rPr>
         <w:t>Basic Behaviors</w:t>
       </w:r>
       <w:bookmarkEnd w:id="10"/>
@@ -4013,7 +5221,7 @@
           <w:rFonts w:eastAsiaTheme="minorEastAsia"/>
         </w:rPr>
       </w:pPr>
-      <w:bookmarkStart w:id="11" w:name="_Toc182310368"/>
+      <w:bookmarkStart w:id="11" w:name="_Toc184219171"/>
       <w:r>
         <w:rPr>
           <w:rFonts w:eastAsiaTheme="minorEastAsia"/>
@@ -4046,7 +5254,6 @@
         </w:rPr>
         <w:t xml:space="preserve"> time variable called </w:t>
       </w:r>
-      <w:proofErr w:type="spellStart"/>
       <w:r>
         <w:rPr>
           <w:rFonts w:eastAsiaTheme="minorEastAsia"/>
@@ -4055,7 +5262,6 @@
         </w:rPr>
         <w:t>TimeWindow</w:t>
       </w:r>
-      <w:proofErr w:type="spellEnd"/>
       <w:r>
         <w:rPr>
           <w:rFonts w:eastAsiaTheme="minorEastAsia"/>
@@ -4097,15 +5303,7 @@
         <w:rPr>
           <w:rFonts w:eastAsiaTheme="minorEastAsia"/>
         </w:rPr>
-        <w:t xml:space="preserve">service has been configured with </w:t>
-      </w:r>
-      <w:proofErr w:type="spellStart"/>
-      <w:proofErr w:type="gramStart"/>
-      <w:r>
-        <w:rPr>
-          <w:rFonts w:eastAsiaTheme="minorEastAsia"/>
-        </w:rPr>
-        <w:t>T</w:t>
+        <w:t>service has been configured with T</w:t>
       </w:r>
       <w:r>
         <w:rPr>
@@ -4123,9 +5321,8 @@
         <w:rPr>
           <w:rFonts w:eastAsiaTheme="minorEastAsia"/>
         </w:rPr>
-        <w:t>indow</w:t>
-      </w:r>
-      <w:proofErr w:type="spellEnd"/>
+        <w:t xml:space="preserve">indow </w:t>
+      </w:r>
       <w:r>
         <w:rPr>
           <w:rFonts w:eastAsiaTheme="minorEastAsia"/>
@@ -4136,20 +5333,7 @@
         <w:rPr>
           <w:rFonts w:eastAsiaTheme="minorEastAsia"/>
         </w:rPr>
-        <w:t xml:space="preserve"> </w:t>
-      </w:r>
-      <w:r>
-        <w:rPr>
-          <w:rFonts w:eastAsiaTheme="minorEastAsia"/>
-        </w:rPr>
-        <w:t>set</w:t>
-      </w:r>
-      <w:proofErr w:type="gramEnd"/>
-      <w:r>
-        <w:rPr>
-          <w:rFonts w:eastAsiaTheme="minorEastAsia"/>
-        </w:rPr>
-        <w:t xml:space="preserve"> to 10 seconds</w:t>
+        <w:t>set to 10 seconds</w:t>
       </w:r>
       <w:r>
         <w:rPr>
@@ -4255,25 +5439,7 @@
           <w:b/>
           <w:bCs/>
         </w:rPr>
-        <w:t xml:space="preserve"> + </w:t>
-      </w:r>
-      <w:proofErr w:type="spellStart"/>
-      <w:r>
-        <w:rPr>
-          <w:rFonts w:eastAsiaTheme="minorEastAsia"/>
-          <w:b/>
-          <w:bCs/>
-        </w:rPr>
-        <w:t>TimeWindow</w:t>
-      </w:r>
-      <w:proofErr w:type="spellEnd"/>
-      <w:r>
-        <w:rPr>
-          <w:rFonts w:eastAsiaTheme="minorEastAsia"/>
-          <w:b/>
-          <w:bCs/>
-        </w:rPr>
-        <w:t>]</w:t>
+        <w:t xml:space="preserve"> + TimeWindow]</w:t>
       </w:r>
       <w:r>
         <w:rPr>
@@ -4289,7 +5455,7 @@
           <w:rFonts w:eastAsiaTheme="minorEastAsia"/>
         </w:rPr>
       </w:pPr>
-      <w:bookmarkStart w:id="12" w:name="_Toc182310369"/>
+      <w:bookmarkStart w:id="12" w:name="_Toc184219172"/>
       <w:r>
         <w:rPr>
           <w:rFonts w:eastAsiaTheme="minorEastAsia"/>
@@ -4342,21 +5508,7 @@
         <w:rPr>
           <w:rFonts w:eastAsiaTheme="minorEastAsia"/>
         </w:rPr>
-        <w:t xml:space="preserve">he service will wait until OpenUxAS has declared all zones, then </w:t>
-      </w:r>
-      <w:proofErr w:type="gramStart"/>
-      <w:r>
-        <w:rPr>
-          <w:rFonts w:eastAsiaTheme="minorEastAsia"/>
-        </w:rPr>
-        <w:t>merge</w:t>
-      </w:r>
-      <w:proofErr w:type="gramEnd"/>
-      <w:r>
-        <w:rPr>
-          <w:rFonts w:eastAsiaTheme="minorEastAsia"/>
-        </w:rPr>
-        <w:t xml:space="preserve"> zones, and then declare the merged zones with new ids.</w:t>
+        <w:t>he service will wait until OpenUxAS has declared all zones, then merge zones, and then declare the merged zones with new ids.</w:t>
       </w:r>
       <w:r>
         <w:rPr>
@@ -4438,6 +5590,7 @@
           <w:b/>
           <w:bCs/>
         </w:rPr>
+        <w:lastRenderedPageBreak/>
         <w:t xml:space="preserve">Tech </w:t>
       </w:r>
       <w:r>
@@ -4452,35 +5605,7 @@
         <w:rPr>
           <w:rFonts w:eastAsiaTheme="minorEastAsia"/>
         </w:rPr>
-        <w:t xml:space="preserve"> The basic zones thus created should generally match the way zones are merged and processed by other services in OpenUxAS. However, </w:t>
-      </w:r>
-      <w:proofErr w:type="gramStart"/>
-      <w:r>
-        <w:rPr>
-          <w:rFonts w:eastAsiaTheme="minorEastAsia"/>
-        </w:rPr>
-        <w:t>as of yet</w:t>
-      </w:r>
-      <w:proofErr w:type="gramEnd"/>
-      <w:r>
-        <w:rPr>
-          <w:rFonts w:eastAsiaTheme="minorEastAsia"/>
-        </w:rPr>
-        <w:t xml:space="preserve">, services do not share this information. It is possible that refactoring the system to have a zone merging service, with declared IDs shared by all other services route planning, motion planning, </w:t>
-      </w:r>
-      <w:proofErr w:type="spellStart"/>
-      <w:r>
-        <w:rPr>
-          <w:rFonts w:eastAsiaTheme="minorEastAsia"/>
-        </w:rPr>
-        <w:t>etc</w:t>
-      </w:r>
-      <w:proofErr w:type="spellEnd"/>
-      <w:r>
-        <w:rPr>
-          <w:rFonts w:eastAsiaTheme="minorEastAsia"/>
-        </w:rPr>
-        <w:t xml:space="preserve">, might be of value. </w:t>
+        <w:t xml:space="preserve"> The basic zones thus created should generally match the way zones are merged and processed by other services in OpenUxAS. However, as of yet, services do not share this information. It is possible that refactoring the system to have a zone merging service, with declared IDs shared by all other services route planning, motion planning, etc, might be of value. </w:t>
       </w:r>
     </w:p>
     <w:p>
@@ -4526,21 +5651,19 @@
         <w:rPr>
           <w:rFonts w:eastAsiaTheme="minorEastAsia"/>
         </w:rPr>
-        <w:t xml:space="preserve">Zones are merged using a standard algorithm as follows. Given a set of overlapping zones of the same type (keep-in or keep-out), then the merged resulting zone takes on the minimum, minimum altitude, and maximum, maximum altitude from the polyhedral of the zones in the set. In addition, the zone polygons in the x-y plan are merged in a “shrink-wrap” style. That is, if one takes </w:t>
-      </w:r>
-      <w:proofErr w:type="gramStart"/>
-      <w:r>
-        <w:rPr>
-          <w:rFonts w:eastAsiaTheme="minorEastAsia"/>
-        </w:rPr>
-        <w:t>all of</w:t>
-      </w:r>
-      <w:proofErr w:type="gramEnd"/>
-      <w:r>
-        <w:rPr>
-          <w:rFonts w:eastAsiaTheme="minorEastAsia"/>
-        </w:rPr>
-        <w:t xml:space="preserve"> the zones in the set and represents their polygons in the x-y plane, and one surrounds these with a string and pulls them tight, the resulting defined polygon edges represent the merged zone in the x-y plane.</w:t>
+        <w:t>Zones are merged using a standard algorithm as follows. Given a set of overlapping zones of the same type (keep-in or keep-out), then the merged resulting zone</w:t>
+      </w:r>
+      <w:r>
+        <w:rPr>
+          <w:rFonts w:eastAsiaTheme="minorEastAsia"/>
+        </w:rPr>
+        <w:t>s are only defined as a projection on the horizontal plane. The boundary of the merged zones are a merge of the polygonal boundaries of the original zones as defined on the x-y plane. No altitudes are defined for the merged zones and it is assume that within their horizontal polygon they include all altitudes.  T</w:t>
+      </w:r>
+      <w:r>
+        <w:rPr>
+          <w:rFonts w:eastAsiaTheme="minorEastAsia"/>
+        </w:rPr>
+        <w:t>he zone polygons in the x-y plan are merged in a “shrink-wrap” style. That is, if one takes all of the zones in the set and represents their polygons in the x-y plane, and one surrounds these with a string and pulls them tight, the resulting defined polygon edges represent the merged zone in the x-y plane.</w:t>
       </w:r>
     </w:p>
     <w:p>
@@ -4564,31 +5687,107 @@
           <w:b/>
           <w:bCs/>
         </w:rPr>
-        <w:t xml:space="preserve">A Warning About Removed Holes </w:t>
-      </w:r>
-      <w:proofErr w:type="gramStart"/>
+        <w:t>A Warning About Removed Holes In Merged Zones</w:t>
+      </w:r>
+      <w:r>
+        <w:rPr>
+          <w:rFonts w:eastAsiaTheme="minorEastAsia"/>
+        </w:rPr>
+        <w:t>: Note that “shrink-wrap” merging can eliminate holes that were present in the original set of zones. For example, if one had an overlapping set of keep-in zones that created a 2d ring around a city, and then “shrink wrap” merged them, then the resulting keep-in zone will represent the outer boundary of the merged zones, but the hole in the middle will be gone and will be part of the resulting keep-in zone. The user should make sure to declare explicit keep-out zones where they are implied by holes in keep-in zone sets, BEFORE the alert service performs merging.</w:t>
+      </w:r>
+    </w:p>
+    <w:p>
+      <w:pPr>
+        <w:ind w:firstLine="0"/>
+        <w:rPr>
+          <w:rFonts w:eastAsiaTheme="minorEastAsia"/>
+        </w:rPr>
+      </w:pPr>
+    </w:p>
+    <w:p>
+      <w:pPr>
+        <w:ind w:firstLine="0"/>
+        <w:rPr>
+          <w:rFonts w:eastAsiaTheme="minorEastAsia"/>
+        </w:rPr>
+      </w:pPr>
       <w:r>
         <w:rPr>
           <w:rFonts w:eastAsiaTheme="minorEastAsia"/>
           <w:b/>
           <w:bCs/>
         </w:rPr>
-        <w:t>In</w:t>
-      </w:r>
-      <w:proofErr w:type="gramEnd"/>
+        <w:t xml:space="preserve">A Warning About </w:t>
+      </w:r>
       <w:r>
         <w:rPr>
           <w:rFonts w:eastAsiaTheme="minorEastAsia"/>
           <w:b/>
           <w:bCs/>
         </w:rPr>
-        <w:t xml:space="preserve"> Merged Zones</w:t>
-      </w:r>
-      <w:r>
-        <w:rPr>
-          <w:rFonts w:eastAsiaTheme="minorEastAsia"/>
-        </w:rPr>
-        <w:t>: Note that “shrink-wrap” merging can eliminate holes that were present in the original set of zones. For example, if one had an overlapping set of keep-in zones that created a 2d ring around a city, and then “shrink wrap” merged them, then the resulting keep-in zone will represent the outer boundary of the merged zones, but the hole in the middle will be gone and will be part of the resulting keep-in zone. The user should make sure to declare explicit keep-out zones where they are implied by holes in keep-in zone sets, BEFORE the alert service performs merging.</w:t>
+        <w:t>Non</w:t>
+      </w:r>
+      <w:r>
+        <w:rPr>
+          <w:rFonts w:eastAsiaTheme="minorEastAsia"/>
+          <w:b/>
+          <w:bCs/>
+        </w:rPr>
+        <w:t>-</w:t>
+      </w:r>
+      <w:r>
+        <w:rPr>
+          <w:rFonts w:eastAsiaTheme="minorEastAsia"/>
+          <w:b/>
+          <w:bCs/>
+        </w:rPr>
+        <w:t>transitivity and Non</w:t>
+      </w:r>
+      <w:r>
+        <w:rPr>
+          <w:rFonts w:eastAsiaTheme="minorEastAsia"/>
+          <w:b/>
+          <w:bCs/>
+        </w:rPr>
+        <w:t>-</w:t>
+      </w:r>
+      <w:r>
+        <w:rPr>
+          <w:rFonts w:eastAsiaTheme="minorEastAsia"/>
+          <w:b/>
+          <w:bCs/>
+        </w:rPr>
+        <w:t>associativity</w:t>
+      </w:r>
+      <w:r>
+        <w:rPr>
+          <w:rFonts w:eastAsiaTheme="minorEastAsia"/>
+        </w:rPr>
+        <w:t xml:space="preserve">: </w:t>
+      </w:r>
+      <w:r>
+        <w:rPr>
+          <w:rFonts w:eastAsiaTheme="minorEastAsia"/>
+        </w:rPr>
+        <w:t xml:space="preserve">The polygon merge applied is not order independent. When three or more zones exist, </w:t>
+      </w:r>
+      <w:r>
+        <w:rPr>
+          <w:rFonts w:eastAsiaTheme="minorEastAsia"/>
+        </w:rPr>
+        <w:t xml:space="preserve">the geometric results of the merger can </w:t>
+      </w:r>
+      <w:r>
+        <w:rPr>
+          <w:rFonts w:eastAsiaTheme="minorEastAsia"/>
+        </w:rPr>
+        <w:t>be</w:t>
+      </w:r>
+      <w:r>
+        <w:rPr>
+          <w:rFonts w:eastAsiaTheme="minorEastAsia"/>
+        </w:rPr>
+        <w:t xml:space="preserve"> order dependent.</w:t>
       </w:r>
     </w:p>
     <w:p>
@@ -4634,7 +5833,7 @@
           <w:rFonts w:eastAsiaTheme="minorEastAsia"/>
         </w:rPr>
       </w:pPr>
-      <w:bookmarkStart w:id="13" w:name="_Toc182310370"/>
+      <w:bookmarkStart w:id="13" w:name="_Toc184219173"/>
       <w:r>
         <w:rPr>
           <w:rFonts w:eastAsiaTheme="minorEastAsia"/>
@@ -4782,12 +5981,25 @@
           <w:rFonts w:eastAsiaTheme="minorEastAsia"/>
         </w:rPr>
       </w:pPr>
-      <w:bookmarkStart w:id="14" w:name="_Toc182310371"/>
-      <w:r>
-        <w:rPr>
-          <w:rFonts w:eastAsiaTheme="minorEastAsia"/>
-        </w:rPr>
+      <w:bookmarkStart w:id="14" w:name="_Toc184219174"/>
+      <w:r>
+        <w:rPr>
+          <w:rFonts w:eastAsiaTheme="minorEastAsia"/>
+        </w:rPr>
+        <w:lastRenderedPageBreak/>
         <w:t xml:space="preserve">Existing Zone </w:t>
+      </w:r>
+      <w:r>
+        <w:rPr>
+          <w:rFonts w:eastAsiaTheme="minorEastAsia"/>
+        </w:rPr>
+        <w:t>Projection</w:t>
+      </w:r>
+      <w:r>
+        <w:rPr>
+          <w:rFonts w:eastAsiaTheme="minorEastAsia"/>
+        </w:rPr>
+        <w:t xml:space="preserve"> </w:t>
       </w:r>
       <w:r>
         <w:rPr>
@@ -4814,21 +6026,19 @@
         <w:rPr>
           <w:lang w:eastAsia="de-DE"/>
         </w:rPr>
-        <w:t xml:space="preserve">reported position is checked for existing violation with </w:t>
-      </w:r>
-      <w:proofErr w:type="gramStart"/>
+        <w:t xml:space="preserve">reported position is checked for existing </w:t>
+      </w:r>
       <w:r>
         <w:rPr>
           <w:lang w:eastAsia="de-DE"/>
         </w:rPr>
-        <w:t>each and every</w:t>
-      </w:r>
-      <w:proofErr w:type="gramEnd"/>
+        <w:t xml:space="preserve">zone projection </w:t>
+      </w:r>
       <w:r>
         <w:rPr>
           <w:lang w:eastAsia="de-DE"/>
         </w:rPr>
-        <w:t xml:space="preserve"> merged keep-in and keep-out zone. Violation is defined as follows:</w:t>
+        <w:t>violation with each and every merged keep-in and keep-out zone. Violation is defined as follows:</w:t>
       </w:r>
     </w:p>
     <w:p>
@@ -4848,12 +6058,28 @@
           <w:bCs/>
           <w:lang w:eastAsia="de-DE"/>
         </w:rPr>
-        <w:t>Existing Keep-Out Zone Violation</w:t>
-      </w:r>
-      <w:r>
-        <w:rPr>
+        <w:t xml:space="preserve">Existing Keep-Out Zone </w:t>
+      </w:r>
+      <w:r>
+        <w:rPr>
+          <w:b/>
+          <w:bCs/>
           <w:lang w:eastAsia="de-DE"/>
         </w:rPr>
+        <w:t xml:space="preserve">Projection </w:t>
+      </w:r>
+      <w:r>
+        <w:rPr>
+          <w:b/>
+          <w:bCs/>
+          <w:lang w:eastAsia="de-DE"/>
+        </w:rPr>
+        <w:t>Violation</w:t>
+      </w:r>
+      <w:r>
+        <w:rPr>
+          <w:lang w:eastAsia="de-DE"/>
+        </w:rPr>
         <w:t xml:space="preserve">: </w:t>
       </w:r>
       <w:r>
@@ -4872,13 +6098,19 @@
         <w:rPr>
           <w:lang w:eastAsia="de-DE"/>
         </w:rPr>
-        <w:t xml:space="preserve">zone if and only if the reported position of the vehicle is on or inside the polyhedron defined for the merged </w:t>
+        <w:t xml:space="preserve">zone if and only if the reported position of the vehicle is on or inside the </w:t>
       </w:r>
       <w:r>
         <w:rPr>
           <w:lang w:eastAsia="de-DE"/>
         </w:rPr>
-        <w:t>keep-out zone.</w:t>
+        <w:t>polygonal boundary of the merged keep-out zone, both projected on the horizontal plane.</w:t>
+      </w:r>
+      <w:r>
+        <w:rPr>
+          <w:lang w:eastAsia="de-DE"/>
+        </w:rPr>
+        <w:t>.</w:t>
       </w:r>
     </w:p>
     <w:p>
@@ -4898,38 +6130,104 @@
           <w:b/>
           <w:bCs/>
         </w:rPr>
-        <w:t>Existing Keep-In Zone Violation</w:t>
-      </w:r>
-      <w:r>
-        <w:rPr>
-          <w:rFonts w:eastAsiaTheme="minorEastAsia"/>
-        </w:rPr>
-        <w:t>: The vehicle of the just-received report is in violation with a merged keep-in zone if and only if the vehicle was in the merged keep-in zone polyhedron according to its first vehicle state report and the position of the just-received report is not in or on the merged keep-in zone polyhedron.</w:t>
+        <w:t xml:space="preserve">Existing Keep-In Zone </w:t>
+      </w:r>
+      <w:r>
+        <w:rPr>
+          <w:rFonts w:eastAsiaTheme="minorEastAsia"/>
+          <w:b/>
+          <w:bCs/>
+        </w:rPr>
+        <w:t xml:space="preserve">Projection </w:t>
+      </w:r>
+      <w:r>
+        <w:rPr>
+          <w:rFonts w:eastAsiaTheme="minorEastAsia"/>
+          <w:b/>
+          <w:bCs/>
+        </w:rPr>
+        <w:t>Violation</w:t>
+      </w:r>
+      <w:r>
+        <w:rPr>
+          <w:rFonts w:eastAsiaTheme="minorEastAsia"/>
+        </w:rPr>
+        <w:t xml:space="preserve">: The vehicle of the just-received report is in violation with a merged keep-in zone if and only if the vehicle was in the merged keep-in zone </w:t>
+      </w:r>
+      <w:r>
+        <w:rPr>
+          <w:rFonts w:eastAsiaTheme="minorEastAsia"/>
+        </w:rPr>
+        <w:t>polygo</w:t>
+      </w:r>
+      <w:r>
+        <w:rPr>
+          <w:rFonts w:eastAsiaTheme="minorEastAsia"/>
+        </w:rPr>
+        <w:t xml:space="preserve"> according to its first vehicle state report </w:t>
+      </w:r>
+      <w:r>
+        <w:rPr>
+          <w:rFonts w:eastAsiaTheme="minorEastAsia"/>
+        </w:rPr>
+        <w:t xml:space="preserve">when both are projected on the horizontal plane, </w:t>
+      </w:r>
+      <w:r>
+        <w:rPr>
+          <w:rFonts w:eastAsiaTheme="minorEastAsia"/>
+        </w:rPr>
+        <w:t xml:space="preserve">and the position of the just-received report is not in or on the merged keep-in zone </w:t>
+      </w:r>
+      <w:r>
+        <w:rPr>
+          <w:rFonts w:eastAsiaTheme="minorEastAsia"/>
+        </w:rPr>
+        <w:t>polygon when both are projected in the horizontal plane</w:t>
+      </w:r>
+      <w:r>
+        <w:rPr>
+          <w:rFonts w:eastAsiaTheme="minorEastAsia"/>
+        </w:rPr>
+        <w:t>.</w:t>
       </w:r>
     </w:p>
     <w:p>
       <w:pPr>
-        <w:ind w:left="360" w:firstLine="0"/>
-        <w:rPr>
-          <w:rFonts w:eastAsiaTheme="minorEastAsia"/>
-        </w:rPr>
-      </w:pPr>
-      <w:r>
-        <w:rPr>
-          <w:rFonts w:eastAsiaTheme="minorEastAsia"/>
-        </w:rPr>
-        <w:t>The alert system produces accurate alerts from state reports for existing violations. All and only violations for a given position of a state report are produced.</w:t>
-      </w:r>
+        <w:ind w:firstLine="0"/>
+        <w:rPr>
+          <w:rFonts w:eastAsiaTheme="minorEastAsia"/>
+        </w:rPr>
+      </w:pPr>
     </w:p>
     <w:p>
       <w:pPr>
+        <w:ind w:firstLine="0"/>
+        <w:rPr>
+          <w:rFonts w:eastAsiaTheme="minorEastAsia"/>
+        </w:rPr>
+      </w:pPr>
+      <w:r>
+        <w:rPr>
+          <w:rFonts w:eastAsiaTheme="minorEastAsia"/>
+        </w:rPr>
+        <w:t xml:space="preserve">The position and time of the alert are the current 3D position and time at the vehicle in the state report. </w:t>
+      </w:r>
+      <w:r>
+        <w:rPr>
+          <w:rFonts w:eastAsiaTheme="minorEastAsia"/>
+        </w:rPr>
+        <w:t>The alert system produces accurate alerts from state reports for existing violations. All and only violations for a given position of a state report are produced.</w:t>
+      </w:r>
+    </w:p>
+    <w:p>
+      <w:pPr>
         <w:pStyle w:val="Heading2Num"/>
         <w:ind w:left="0" w:firstLine="0"/>
         <w:rPr>
           <w:rFonts w:eastAsiaTheme="minorEastAsia"/>
         </w:rPr>
       </w:pPr>
-      <w:bookmarkStart w:id="15" w:name="_Toc182310372"/>
+      <w:bookmarkStart w:id="15" w:name="_Toc184219175"/>
       <w:r>
         <w:rPr>
           <w:rFonts w:eastAsiaTheme="minorEastAsia"/>
@@ -4941,6 +6239,12 @@
           <w:rFonts w:eastAsiaTheme="minorEastAsia"/>
         </w:rPr>
         <w:t xml:space="preserve"> Zone </w:t>
+      </w:r>
+      <w:r>
+        <w:rPr>
+          <w:rFonts w:eastAsiaTheme="minorEastAsia"/>
+        </w:rPr>
+        <w:t xml:space="preserve">Projection </w:t>
       </w:r>
       <w:r>
         <w:rPr>
@@ -4961,7 +6265,19 @@
         <w:rPr>
           <w:lang w:eastAsia="de-DE"/>
         </w:rPr>
-        <w:t xml:space="preserve">When a vehicle state report is received, the vehicle reported position and vehicle reported instantaneous velocity are used to compute imminent zone violations. </w:t>
+        <w:t xml:space="preserve">When a vehicle state report is received, the vehicle reported position and vehicle reported instantaneous velocity are used to compute imminent zone </w:t>
+      </w:r>
+      <w:r>
+        <w:rPr>
+          <w:lang w:eastAsia="de-DE"/>
+        </w:rPr>
+        <w:t xml:space="preserve">projection </w:t>
+      </w:r>
+      <w:r>
+        <w:rPr>
+          <w:lang w:eastAsia="de-DE"/>
+        </w:rPr>
+        <w:t xml:space="preserve">violations. </w:t>
       </w:r>
     </w:p>
     <w:p>
@@ -4983,8 +6299,31 @@
         <w:rPr>
           <w:lang w:eastAsia="de-DE"/>
         </w:rPr>
-        <w:lastRenderedPageBreak/>
-        <w:t xml:space="preserve">Imminent Zone Violations depend on the computation of the linear </w:t>
+        <w:t xml:space="preserve">Imminent Zone </w:t>
+      </w:r>
+      <w:r>
+        <w:rPr>
+          <w:lang w:eastAsia="de-DE"/>
+        </w:rPr>
+        <w:t xml:space="preserve">Projection </w:t>
+      </w:r>
+      <w:r>
+        <w:rPr>
+          <w:lang w:eastAsia="de-DE"/>
+        </w:rPr>
+        <w:t xml:space="preserve">Violations depend on the computation of the </w:t>
+      </w:r>
+      <w:r>
+        <w:rPr>
+          <w:lang w:eastAsia="de-DE"/>
+        </w:rPr>
+        <w:t xml:space="preserve">projected </w:t>
+      </w:r>
+      <w:r>
+        <w:rPr>
+          <w:lang w:eastAsia="de-DE"/>
+        </w:rPr>
+        <w:t xml:space="preserve">linear </w:t>
       </w:r>
       <w:r>
         <w:rPr>
@@ -4998,54 +6337,167 @@
         <w:rPr>
           <w:lang w:eastAsia="de-DE"/>
         </w:rPr>
-        <w:t xml:space="preserve"> of a vehicle from its state report. This is a line segment from, but </w:t>
-      </w:r>
-      <w:proofErr w:type="gramStart"/>
+        <w:t xml:space="preserve"> of a vehicle from its state report. </w:t>
+      </w:r>
       <w:r>
         <w:rPr>
           <w:lang w:eastAsia="de-DE"/>
         </w:rPr>
-        <w:t>not including,</w:t>
-      </w:r>
-      <w:proofErr w:type="gramEnd"/>
+        <w:t xml:space="preserve">The linear trajectory segment is </w:t>
+      </w:r>
       <w:r>
         <w:rPr>
           <w:lang w:eastAsia="de-DE"/>
         </w:rPr>
-        <w:t xml:space="preserve"> the current position of the vehicle to, and including, the position of the vehicle along its current velocity to the position it will have based on the velocity at the future time </w:t>
-      </w:r>
-      <w:proofErr w:type="spellStart"/>
+        <w:t>a line segment from, but not including, the current position of the vehicle to, and including, the position of the vehicle along its current velocity to the position it will have based on the velocity at the future time TimeWIndow relative to the time of the state report</w:t>
+      </w:r>
       <w:r>
         <w:rPr>
           <w:lang w:eastAsia="de-DE"/>
         </w:rPr>
-        <w:t>TimeWIndow</w:t>
-      </w:r>
-      <w:proofErr w:type="spellEnd"/>
+        <w:t>.</w:t>
+      </w:r>
       <w:r>
         <w:rPr>
           <w:lang w:eastAsia="de-DE"/>
         </w:rPr>
-        <w:t xml:space="preserve"> relative to the time of the state report. It is a line segment that begins but does not include the reported position and ending at the expected position of the vehicle at time </w:t>
-      </w:r>
-      <w:proofErr w:type="spellStart"/>
+        <w:t xml:space="preserve"> </w:t>
+      </w:r>
       <w:r>
         <w:rPr>
           <w:lang w:eastAsia="de-DE"/>
         </w:rPr>
-        <w:t>TimeWIndow</w:t>
-      </w:r>
-      <w:proofErr w:type="spellEnd"/>
-      <w:r>
-        <w:rPr>
-          <w:lang w:eastAsia="de-DE"/>
-        </w:rPr>
-        <w:t xml:space="preserve"> after the state report, assuming the vehicle continues along the linear trajectory of its reported instantaneous velocity. </w:t>
+        <w:t>This trajectory model implicitly assumes the vehicle continues along its immediately reported</w:t>
       </w:r>
     </w:p>
     <w:p>
-      <w:r>
-        <w:t>For the mathematically included, this is a parametrically defined line segment defined by the reported velocity vector and position of the vehicle over the time interval (</w:t>
+      <w:pPr>
+        <w:pStyle w:val="NormalNoIndent"/>
+        <w:rPr>
+          <w:lang w:eastAsia="de-DE"/>
+        </w:rPr>
+      </w:pPr>
+    </w:p>
+    <w:p>
+      <w:pPr>
+        <w:pStyle w:val="NormalNoIndent"/>
+        <w:rPr>
+          <w:lang w:eastAsia="de-DE"/>
+        </w:rPr>
+      </w:pPr>
+      <w:r>
+        <w:rPr>
+          <w:lang w:eastAsia="de-DE"/>
+        </w:rPr>
+        <w:t xml:space="preserve">The </w:t>
+      </w:r>
+      <w:r>
+        <w:rPr>
+          <w:b/>
+          <w:bCs/>
+          <w:lang w:eastAsia="de-DE"/>
+        </w:rPr>
+        <w:t xml:space="preserve">projected linear trajectory segment </w:t>
+      </w:r>
+      <w:r>
+        <w:rPr>
+          <w:lang w:eastAsia="de-DE"/>
+        </w:rPr>
+        <w:t xml:space="preserve">is the projection of </w:t>
+      </w:r>
+      <w:r>
+        <w:rPr>
+          <w:lang w:eastAsia="de-DE"/>
+        </w:rPr>
+        <w:t xml:space="preserve">the </w:t>
+      </w:r>
+      <w:r>
+        <w:rPr>
+          <w:lang w:eastAsia="de-DE"/>
+        </w:rPr>
+        <w:t>aforementioned</w:t>
+      </w:r>
+      <w:r>
+        <w:rPr>
+          <w:lang w:eastAsia="de-DE"/>
+        </w:rPr>
+        <w:t xml:space="preserve"> linear trajectory</w:t>
+      </w:r>
+      <w:r>
+        <w:rPr>
+          <w:lang w:eastAsia="de-DE"/>
+        </w:rPr>
+        <w:t xml:space="preserve"> </w:t>
+      </w:r>
+      <w:r>
+        <w:rPr>
+          <w:lang w:eastAsia="de-DE"/>
+        </w:rPr>
+        <w:t xml:space="preserve">onto the horizontal plane. </w:t>
+      </w:r>
+      <w:r>
+        <w:rPr>
+          <w:lang w:eastAsia="de-DE"/>
+        </w:rPr>
+        <w:t>It is a line segment that begins but does not include the reported position</w:t>
+      </w:r>
+      <w:r>
+        <w:rPr>
+          <w:lang w:eastAsia="de-DE"/>
+        </w:rPr>
+        <w:t xml:space="preserve"> on the horizontal plane, and </w:t>
+      </w:r>
+      <w:r>
+        <w:rPr>
+          <w:lang w:eastAsia="de-DE"/>
+        </w:rPr>
+        <w:t>ends</w:t>
+      </w:r>
+      <w:r>
+        <w:rPr>
+          <w:lang w:eastAsia="de-DE"/>
+        </w:rPr>
+        <w:t xml:space="preserve"> with and includes the </w:t>
+      </w:r>
+      <w:r>
+        <w:rPr>
+          <w:lang w:eastAsia="de-DE"/>
+        </w:rPr>
+        <w:t>expected position of the vehicle at time TimeWIndow after the state report</w:t>
+      </w:r>
+      <w:r>
+        <w:rPr>
+          <w:lang w:eastAsia="de-DE"/>
+        </w:rPr>
+        <w:t xml:space="preserve"> projected on the horizontal plane. linear velocity into the future up to the TimeWindow.</w:t>
+      </w:r>
+    </w:p>
+    <w:p>
+      <w:pPr>
+        <w:pStyle w:val="NormalNoIndent"/>
+        <w:rPr>
+          <w:lang w:eastAsia="de-DE"/>
+        </w:rPr>
+      </w:pPr>
+      <w:r>
+        <w:rPr>
+          <w:lang w:eastAsia="de-DE"/>
+        </w:rPr>
+        <w:t xml:space="preserve"> </w:t>
+      </w:r>
+    </w:p>
+    <w:p>
+      <w:pPr>
+        <w:ind w:firstLine="0"/>
+      </w:pPr>
+      <w:r>
+        <w:t xml:space="preserve">For the mathematically </w:t>
+      </w:r>
+      <w:r>
+        <w:t>inclined</w:t>
+      </w:r>
+      <w:r>
+        <w:t>, this is a parametrically defined line segment defined by the reported velocity vector and position of the vehicle over the time interval (</w:t>
       </w:r>
       <w:r>
         <w:rPr>
@@ -5083,7 +6535,6 @@
       <w:r>
         <w:t xml:space="preserve"> + </w:t>
       </w:r>
-      <w:proofErr w:type="spellStart"/>
       <w:r>
         <w:rPr>
           <w:b/>
@@ -5091,9 +6542,11 @@
         </w:rPr>
         <w:t>TimeWindow</w:t>
       </w:r>
-      <w:proofErr w:type="spellEnd"/>
-      <w:r>
-        <w:t>].</w:t>
+      <w:r>
+        <w:t>]</w:t>
+      </w:r>
+      <w:r>
+        <w:t xml:space="preserve"> projected onto the horizontal plane.</w:t>
       </w:r>
     </w:p>
     <w:p>
@@ -5131,16 +6584,58 @@
           <w:b/>
           <w:bCs/>
         </w:rPr>
-        <w:t>Imminent Keep-Out Zone Violation</w:t>
-      </w:r>
-      <w:r>
-        <w:t xml:space="preserve">: For a given vehicle state report, the vehicle is in imminent keep-out zone violation with a merged keep-out zone if and only if </w:t>
-      </w:r>
-      <w:r>
-        <w:t xml:space="preserve">the vehicle is not in existing violation with the zone and </w:t>
-      </w:r>
-      <w:r>
-        <w:t>one or more positions on the trajectory segment are in or on the merged zone’s polyhedron.</w:t>
+        <w:t>Imminent</w:t>
+      </w:r>
+      <w:r>
+        <w:rPr>
+          <w:b/>
+          <w:bCs/>
+        </w:rPr>
+        <w:t xml:space="preserve"> Projected</w:t>
+      </w:r>
+      <w:r>
+        <w:rPr>
+          <w:b/>
+          <w:bCs/>
+        </w:rPr>
+        <w:t xml:space="preserve"> Keep-Out Zone Violation</w:t>
+      </w:r>
+      <w:r>
+        <w:t xml:space="preserve">: For a given vehicle state report, the vehicle is in imminent </w:t>
+      </w:r>
+      <w:r>
+        <w:t xml:space="preserve">projected </w:t>
+      </w:r>
+      <w:r>
+        <w:t xml:space="preserve">keep-out zone violation with a merged keep-out zone if and only if </w:t>
+      </w:r>
+      <w:r>
+        <w:t xml:space="preserve">the vehicle is not in existing </w:t>
+      </w:r>
+      <w:r>
+        <w:t xml:space="preserve">projected </w:t>
+      </w:r>
+      <w:r>
+        <w:t xml:space="preserve">violation with the </w:t>
+      </w:r>
+      <w:r>
+        <w:lastRenderedPageBreak/>
+        <w:t xml:space="preserve">zone and </w:t>
+      </w:r>
+      <w:r>
+        <w:t xml:space="preserve">one or more positions on the </w:t>
+      </w:r>
+      <w:r>
+        <w:t xml:space="preserve">projected </w:t>
+      </w:r>
+      <w:r>
+        <w:t xml:space="preserve">trajectory segment are in or on the merged zone’s </w:t>
+      </w:r>
+      <w:r>
+        <w:t>polygon boundary in the horizontal plane</w:t>
+      </w:r>
+      <w:r>
+        <w:t>.</w:t>
       </w:r>
     </w:p>
     <w:p>
@@ -5156,16 +6651,87 @@
           <w:b/>
           <w:bCs/>
         </w:rPr>
-        <w:t>Imminent Keep-In Zone Violation</w:t>
-      </w:r>
-      <w:r>
-        <w:t>: For a given vehicle state report, the vehicle is in imminent keep-in zone violation with a merged keep-in zone if and only if the vehicle was in or on the merged keep-in zone polyhedron according to its initial vehicle report position</w:t>
-      </w:r>
-      <w:r>
-        <w:t xml:space="preserve">, it not in existing violation with the zone, </w:t>
-      </w:r>
-      <w:r>
-        <w:t>and its trajectory segment contains one or more points outside of that merged keep-in zone’s polyhedron.</w:t>
+        <w:t xml:space="preserve">Imminent </w:t>
+      </w:r>
+      <w:r>
+        <w:rPr>
+          <w:b/>
+          <w:bCs/>
+        </w:rPr>
+        <w:t xml:space="preserve">Projected </w:t>
+      </w:r>
+      <w:r>
+        <w:rPr>
+          <w:b/>
+          <w:bCs/>
+        </w:rPr>
+        <w:t>Keep-In Zone Violation</w:t>
+      </w:r>
+      <w:r>
+        <w:t xml:space="preserve">: For a given vehicle state report, the vehicle is in imminent </w:t>
+      </w:r>
+      <w:r>
+        <w:t xml:space="preserve">projected </w:t>
+      </w:r>
+      <w:r>
+        <w:t xml:space="preserve">keep-in zone violation with a merged keep-in zone if and only if the vehicle was in or on the merged keep-in zone </w:t>
+      </w:r>
+      <w:r>
+        <w:t xml:space="preserve">polygon projected </w:t>
+      </w:r>
+      <w:r>
+        <w:t>according to its initial vehicle report</w:t>
+      </w:r>
+      <w:r>
+        <w:t>’s</w:t>
+      </w:r>
+      <w:r>
+        <w:t xml:space="preserve"> position</w:t>
+      </w:r>
+      <w:r>
+        <w:t xml:space="preserve"> projected on the horizontal plane</w:t>
+      </w:r>
+      <w:r>
+        <w:t>, it</w:t>
+      </w:r>
+      <w:r>
+        <w:t>’s horizontal projection</w:t>
+      </w:r>
+      <w:r>
+        <w:t xml:space="preserve"> is</w:t>
+      </w:r>
+      <w:r>
+        <w:t xml:space="preserve"> not in existing violation with the zone</w:t>
+      </w:r>
+      <w:r>
+        <w:t>’s horizontal</w:t>
+      </w:r>
+      <w:r>
+        <w:t xml:space="preserve"> projection</w:t>
+      </w:r>
+      <w:r>
+        <w:t xml:space="preserve">, </w:t>
+      </w:r>
+      <w:r>
+        <w:t xml:space="preserve">and its </w:t>
+      </w:r>
+      <w:r>
+        <w:t xml:space="preserve">projected </w:t>
+      </w:r>
+      <w:r>
+        <w:t xml:space="preserve">trajectory segment contains one or more points outside of that </w:t>
+      </w:r>
+      <w:r>
+        <w:t xml:space="preserve">projected </w:t>
+      </w:r>
+      <w:r>
+        <w:t xml:space="preserve">merged keep-in zone’s </w:t>
+      </w:r>
+      <w:r>
+        <w:t>polygon</w:t>
+      </w:r>
+      <w:r>
+        <w:t>.</w:t>
       </w:r>
     </w:p>
     <w:p>
@@ -5178,7 +6744,13 @@
         <w:ind w:firstLine="0"/>
       </w:pPr>
       <w:r>
-        <w:t>Imminent zone violation is said to occur at the earliest parametric time on the interval (</w:t>
+        <w:t xml:space="preserve">Imminent </w:t>
+      </w:r>
+      <w:r>
+        <w:t xml:space="preserve">projected </w:t>
+      </w:r>
+      <w:r>
+        <w:t>zone violation is said to occur at the earliest parametric time on the interval (</w:t>
       </w:r>
       <w:r>
         <w:rPr>
@@ -5216,7 +6788,6 @@
       <w:r>
         <w:t xml:space="preserve"> + </w:t>
       </w:r>
-      <w:proofErr w:type="spellStart"/>
       <w:r>
         <w:rPr>
           <w:b/>
@@ -5224,9 +6795,20 @@
         </w:rPr>
         <w:t>TimeWindow</w:t>
       </w:r>
-      <w:proofErr w:type="spellEnd"/>
-      <w:r>
-        <w:t xml:space="preserve">] for which the point on the trajectory segment is in violation of the zone, where </w:t>
+      <w:r>
+        <w:t xml:space="preserve">] for which the point on the </w:t>
+      </w:r>
+      <w:r>
+        <w:t xml:space="preserve">projected </w:t>
+      </w:r>
+      <w:r>
+        <w:t xml:space="preserve">trajectory segment is in violation of the </w:t>
+      </w:r>
+      <w:r>
+        <w:t xml:space="preserve">projected </w:t>
+      </w:r>
+      <w:r>
+        <w:t xml:space="preserve">zone, where </w:t>
       </w:r>
       <w:r>
         <w:rPr>
@@ -5244,15 +6826,25 @@
         <w:t>S</w:t>
       </w:r>
       <w:r>
-        <w:t xml:space="preserve"> is the time of the vehicle state report.  The position of the violation is thus the position on the trajectory segment </w:t>
-      </w:r>
-      <w:proofErr w:type="gramStart"/>
-      <w:r>
-        <w:t>at this time</w:t>
-      </w:r>
-      <w:proofErr w:type="gramEnd"/>
-      <w:r>
-        <w:t>. Both are reported in the Imminent Zone Violation alert.</w:t>
+        <w:t xml:space="preserve"> is the time of the vehicle state report.  The position of the violation is the </w:t>
+      </w:r>
+      <w:r>
+        <w:t xml:space="preserve">3D </w:t>
+      </w:r>
+      <w:r>
+        <w:t xml:space="preserve">position on the </w:t>
+      </w:r>
+      <w:r>
+        <w:t xml:space="preserve">3D </w:t>
+      </w:r>
+      <w:r>
+        <w:t>trajectory segment at this time. Both are reported in the Imminent</w:t>
+      </w:r>
+      <w:r>
+        <w:t xml:space="preserve"> Projected</w:t>
+      </w:r>
+      <w:r>
+        <w:t xml:space="preserve"> Zone Violation alert.</w:t>
       </w:r>
     </w:p>
     <w:p>
@@ -5262,7 +6854,7 @@
           <w:rFonts w:eastAsiaTheme="minorEastAsia"/>
         </w:rPr>
       </w:pPr>
-      <w:bookmarkStart w:id="16" w:name="_Toc182310373"/>
+      <w:bookmarkStart w:id="16" w:name="_Toc184219176"/>
       <w:r>
         <w:rPr>
           <w:rFonts w:eastAsiaTheme="minorEastAsia"/>
@@ -5323,7 +6915,7 @@
         </w:rPr>
       </w:pPr>
       <w:bookmarkStart w:id="17" w:name="_Toc157513753"/>
-      <w:bookmarkStart w:id="18" w:name="_Toc182310374"/>
+      <w:bookmarkStart w:id="18" w:name="_Toc184219177"/>
       <w:r>
         <w:rPr>
           <w:rFonts w:eastAsiaTheme="minorEastAsia"/>
@@ -5367,16 +6959,16 @@
     </w:p>
     <w:p>
       <w:pPr>
-        <w:pStyle w:val="Heading2"/>
-        <w:rPr>
-          <w:rFonts w:eastAsiaTheme="minorEastAsia"/>
-        </w:rPr>
-      </w:pPr>
-      <w:r>
-        <w:rPr>
-          <w:rFonts w:eastAsiaTheme="minorEastAsia"/>
-        </w:rPr>
-        <w:lastRenderedPageBreak/>
+        <w:pStyle w:val="Heading2Num"/>
+        <w:rPr>
+          <w:rFonts w:eastAsiaTheme="minorEastAsia"/>
+        </w:rPr>
+      </w:pPr>
+      <w:bookmarkStart w:id="19" w:name="_Toc184219178"/>
+      <w:r>
+        <w:rPr>
+          <w:rFonts w:eastAsiaTheme="minorEastAsia"/>
+        </w:rPr>
         <w:t>Case 1</w:t>
       </w:r>
       <w:r>
@@ -5397,6 +6989,7 @@
         </w:rPr>
         <w:t>Regardless of Staleness</w:t>
       </w:r>
+      <w:bookmarkEnd w:id="19"/>
     </w:p>
     <w:p>
       <w:pPr>
@@ -5506,12 +7099,12 @@
     </w:p>
     <w:p>
       <w:pPr>
-        <w:pStyle w:val="Heading2"/>
-        <w:ind w:left="0" w:firstLine="0"/>
-        <w:rPr>
-          <w:rFonts w:eastAsiaTheme="minorEastAsia"/>
-        </w:rPr>
-      </w:pPr>
+        <w:pStyle w:val="Heading2Num"/>
+        <w:rPr>
+          <w:rFonts w:eastAsiaTheme="minorEastAsia"/>
+        </w:rPr>
+      </w:pPr>
+      <w:bookmarkStart w:id="20" w:name="_Toc184219179"/>
       <w:r>
         <w:rPr>
           <w:rFonts w:eastAsiaTheme="minorEastAsia"/>
@@ -5548,6 +7141,7 @@
         </w:rPr>
         <w:t>Reporting</w:t>
       </w:r>
+      <w:bookmarkEnd w:id="20"/>
     </w:p>
     <w:p>
       <w:pPr>
@@ -5588,13 +7182,77 @@
           <w:b/>
           <w:bCs/>
         </w:rPr>
-        <w:t>Existing Keep-Out Zone Violation</w:t>
-      </w:r>
-      <w:r>
-        <w:rPr>
-          <w:rFonts w:eastAsiaTheme="minorEastAsia"/>
-        </w:rPr>
-        <w:t xml:space="preserve">: For a keep-out zone, a present violation exists if the vehicles reported position in the state report is in or on the zone polyhedron. </w:t>
+        <w:t xml:space="preserve">Existing Keep-Out </w:t>
+      </w:r>
+      <w:r>
+        <w:rPr>
+          <w:rFonts w:eastAsiaTheme="minorEastAsia"/>
+          <w:b/>
+          <w:bCs/>
+        </w:rPr>
+        <w:t xml:space="preserve">Projected </w:t>
+      </w:r>
+      <w:r>
+        <w:rPr>
+          <w:rFonts w:eastAsiaTheme="minorEastAsia"/>
+          <w:b/>
+          <w:bCs/>
+        </w:rPr>
+        <w:t>Zone Violation</w:t>
+      </w:r>
+      <w:r>
+        <w:rPr>
+          <w:rFonts w:eastAsiaTheme="minorEastAsia"/>
+        </w:rPr>
+        <w:t xml:space="preserve">: For a keep-out zone, a present </w:t>
+      </w:r>
+      <w:r>
+        <w:rPr>
+          <w:rFonts w:eastAsiaTheme="minorEastAsia"/>
+        </w:rPr>
+        <w:t xml:space="preserve">projected </w:t>
+      </w:r>
+      <w:r>
+        <w:rPr>
+          <w:rFonts w:eastAsiaTheme="minorEastAsia"/>
+        </w:rPr>
+        <w:t>violation exists if the vehicles</w:t>
+      </w:r>
+      <w:r>
+        <w:rPr>
+          <w:rFonts w:eastAsiaTheme="minorEastAsia"/>
+        </w:rPr>
+        <w:t>’</w:t>
+      </w:r>
+      <w:r>
+        <w:rPr>
+          <w:rFonts w:eastAsiaTheme="minorEastAsia"/>
+        </w:rPr>
+        <w:t xml:space="preserve"> reported in the state report</w:t>
+      </w:r>
+      <w:r>
+        <w:rPr>
+          <w:rFonts w:eastAsiaTheme="minorEastAsia"/>
+        </w:rPr>
+        <w:t>, when projected onto the horizontal plane,</w:t>
+      </w:r>
+      <w:r>
+        <w:rPr>
+          <w:rFonts w:eastAsiaTheme="minorEastAsia"/>
+        </w:rPr>
+        <w:t xml:space="preserve"> is in or on the zone </w:t>
+      </w:r>
+      <w:r>
+        <w:rPr>
+          <w:rFonts w:eastAsiaTheme="minorEastAsia"/>
+        </w:rPr>
+        <w:t>polygon projected on the horizontal plane</w:t>
+      </w:r>
+      <w:r>
+        <w:rPr>
+          <w:rFonts w:eastAsiaTheme="minorEastAsia"/>
+        </w:rPr>
+        <w:t xml:space="preserve">. </w:t>
       </w:r>
     </w:p>
     <w:p>
@@ -5616,28 +7274,131 @@
           <w:bCs/>
           <w:color w:val="000000" w:themeColor="text1"/>
         </w:rPr>
-        <w:t>Existing Keep-In Zone Violation</w:t>
-      </w:r>
-      <w:r>
-        <w:rPr>
-          <w:rFonts w:eastAsiaTheme="minorEastAsia"/>
+        <w:t xml:space="preserve">Existing Keep-In </w:t>
+      </w:r>
+      <w:r>
+        <w:rPr>
+          <w:rFonts w:eastAsiaTheme="minorEastAsia"/>
+          <w:b/>
+          <w:bCs/>
           <w:color w:val="000000" w:themeColor="text1"/>
         </w:rPr>
-        <w:t>: For keep-in zones, by the definition of a keep-in zone violation, the vehicle is in zone violation if its present position is outside any keep-in zone it was within when the vehicle first began operations.</w:t>
+        <w:t xml:space="preserve">Projected </w:t>
+      </w:r>
+      <w:r>
+        <w:rPr>
+          <w:rFonts w:eastAsiaTheme="minorEastAsia"/>
+          <w:b/>
+          <w:bCs/>
+          <w:color w:val="000000" w:themeColor="text1"/>
+        </w:rPr>
+        <w:t>Zone Violation</w:t>
+      </w:r>
+      <w:r>
+        <w:rPr>
+          <w:rFonts w:eastAsiaTheme="minorEastAsia"/>
+          <w:color w:val="000000" w:themeColor="text1"/>
+        </w:rPr>
+        <w:t xml:space="preserve">: For keep-in zones, by the definition of a keep-in </w:t>
+      </w:r>
+      <w:r>
+        <w:rPr>
+          <w:rFonts w:eastAsiaTheme="minorEastAsia"/>
+          <w:color w:val="000000" w:themeColor="text1"/>
+        </w:rPr>
+        <w:t xml:space="preserve">projected </w:t>
+      </w:r>
+      <w:r>
+        <w:rPr>
+          <w:rFonts w:eastAsiaTheme="minorEastAsia"/>
+          <w:color w:val="000000" w:themeColor="text1"/>
+        </w:rPr>
+        <w:t xml:space="preserve">zone violation, the vehicle is in </w:t>
+      </w:r>
+      <w:r>
+        <w:rPr>
+          <w:rFonts w:eastAsiaTheme="minorEastAsia"/>
+          <w:color w:val="000000" w:themeColor="text1"/>
+        </w:rPr>
+        <w:t xml:space="preserve">projected </w:t>
+      </w:r>
+      <w:r>
+        <w:rPr>
+          <w:rFonts w:eastAsiaTheme="minorEastAsia"/>
+          <w:color w:val="000000" w:themeColor="text1"/>
+        </w:rPr>
+        <w:t xml:space="preserve">zone violation if its present </w:t>
+      </w:r>
+      <w:r>
+        <w:rPr>
+          <w:rFonts w:eastAsiaTheme="minorEastAsia"/>
+          <w:color w:val="000000" w:themeColor="text1"/>
+        </w:rPr>
+        <w:t xml:space="preserve">projected </w:t>
+      </w:r>
+      <w:r>
+        <w:rPr>
+          <w:rFonts w:eastAsiaTheme="minorEastAsia"/>
+          <w:color w:val="000000" w:themeColor="text1"/>
+        </w:rPr>
+        <w:t xml:space="preserve">position is outside </w:t>
+      </w:r>
+      <w:r>
+        <w:rPr>
+          <w:rFonts w:eastAsiaTheme="minorEastAsia"/>
+          <w:color w:val="000000" w:themeColor="text1"/>
+        </w:rPr>
+        <w:t xml:space="preserve">the projected </w:t>
+      </w:r>
+      <w:r>
+        <w:rPr>
+          <w:rFonts w:eastAsiaTheme="minorEastAsia"/>
+          <w:color w:val="000000" w:themeColor="text1"/>
+        </w:rPr>
+        <w:t>keep-in zone</w:t>
+      </w:r>
+      <w:r>
+        <w:rPr>
+          <w:rFonts w:eastAsiaTheme="minorEastAsia"/>
+          <w:color w:val="000000" w:themeColor="text1"/>
+        </w:rPr>
+        <w:t xml:space="preserve"> polygon</w:t>
+      </w:r>
+      <w:r>
+        <w:rPr>
+          <w:rFonts w:eastAsiaTheme="minorEastAsia"/>
+          <w:color w:val="000000" w:themeColor="text1"/>
+        </w:rPr>
+        <w:t xml:space="preserve"> it</w:t>
+      </w:r>
+      <w:r>
+        <w:rPr>
+          <w:rFonts w:eastAsiaTheme="minorEastAsia"/>
+          <w:color w:val="000000" w:themeColor="text1"/>
+        </w:rPr>
+        <w:t xml:space="preserve">’s projection </w:t>
+      </w:r>
+      <w:r>
+        <w:rPr>
+          <w:rFonts w:eastAsiaTheme="minorEastAsia"/>
+          <w:color w:val="000000" w:themeColor="text1"/>
+        </w:rPr>
+        <w:t>was within when the vehicle first began operations.</w:t>
       </w:r>
     </w:p>
     <w:p>
       <w:pPr>
-        <w:pStyle w:val="Heading2"/>
-        <w:ind w:left="0" w:firstLine="0"/>
-        <w:rPr>
-          <w:rFonts w:eastAsiaTheme="minorEastAsia"/>
-        </w:rPr>
-      </w:pPr>
-      <w:r>
-        <w:rPr>
-          <w:rFonts w:eastAsiaTheme="minorEastAsia"/>
-        </w:rPr>
+        <w:pStyle w:val="Heading2Num"/>
+        <w:rPr>
+          <w:rFonts w:eastAsiaTheme="minorEastAsia"/>
+        </w:rPr>
+      </w:pPr>
+      <w:bookmarkStart w:id="21" w:name="_Toc184219180"/>
+      <w:r>
+        <w:rPr>
+          <w:rFonts w:eastAsiaTheme="minorEastAsia"/>
+        </w:rPr>
+        <w:lastRenderedPageBreak/>
         <w:t xml:space="preserve">Case </w:t>
       </w:r>
       <w:r>
@@ -5682,6 +7443,7 @@
         </w:rPr>
         <w:t>Reporting</w:t>
       </w:r>
+      <w:bookmarkEnd w:id="21"/>
     </w:p>
     <w:p>
       <w:pPr>
@@ -5738,7 +7500,7 @@
         <w:pStyle w:val="Heading3"/>
       </w:pPr>
       <w:r>
-        <w:t>Projected</w:t>
+        <w:t>Imminent</w:t>
       </w:r>
       <w:r>
         <w:t xml:space="preserve"> Violation Model</w:t>
@@ -5875,7 +7637,6 @@
                                   </w14:textOutline>
                                 </w:rPr>
                               </w:pPr>
-                              <w:proofErr w:type="spellStart"/>
                               <w:r>
                                 <w:rPr>
                                   <w:color w:val="000000" w:themeColor="text1"/>
@@ -5908,7 +7669,6 @@
                                 </w:rPr>
                                 <w:t>s+Tw</w:t>
                               </w:r>
-                              <w:proofErr w:type="spellEnd"/>
                             </w:p>
                           </w:txbxContent>
                         </wps:txbx>
@@ -6830,7 +8590,6 @@
       <w:r>
         <w:t>&lt;=</w:t>
       </w:r>
-      <w:proofErr w:type="spellStart"/>
       <w:r>
         <w:rPr>
           <w:b/>
@@ -6864,7 +8623,6 @@
         </w:rPr>
         <w:t>W</w:t>
       </w:r>
-      <w:proofErr w:type="spellEnd"/>
       <w:r>
         <w:t>.</w:t>
       </w:r>
@@ -6888,9 +8646,20 @@
         <w:rPr>
           <w:lang w:eastAsia="en-US"/>
         </w:rPr>
-        <w:t xml:space="preserve">The model of projected violation is based on the linear projected trajectory of the vehicle from its last state-reported position to the final position in the time window along vector </w:t>
-      </w:r>
-      <w:proofErr w:type="spellStart"/>
+        <w:t xml:space="preserve">The model of projected </w:t>
+      </w:r>
+      <w:r>
+        <w:rPr>
+          <w:lang w:eastAsia="en-US"/>
+        </w:rPr>
+        <w:t xml:space="preserve">imminent </w:t>
+      </w:r>
+      <w:r>
+        <w:rPr>
+          <w:lang w:eastAsia="en-US"/>
+        </w:rPr>
+        <w:t xml:space="preserve">violation is based on the linear projected trajectory of the vehicle from its last state-reported position to the final position in the time window along vector </w:t>
+      </w:r>
       <w:r>
         <w:rPr>
           <w:b/>
@@ -6908,7 +8677,6 @@
         </w:rPr>
         <w:t>v</w:t>
       </w:r>
-      <w:proofErr w:type="spellEnd"/>
       <w:r>
         <w:rPr>
           <w:lang w:eastAsia="en-US"/>
@@ -6961,7 +8729,6 @@
         </w:rPr>
         <w:t xml:space="preserve"> and where </w:t>
       </w:r>
-      <w:proofErr w:type="spellStart"/>
       <w:r>
         <w:rPr>
           <w:b/>
@@ -6979,7 +8746,6 @@
         </w:rPr>
         <w:t>v</w:t>
       </w:r>
-      <w:proofErr w:type="spellEnd"/>
       <w:r>
         <w:rPr>
           <w:lang w:eastAsia="en-US"/>
@@ -6998,7 +8764,6 @@
         </w:rPr>
         <w:t xml:space="preserve"> ground speed of the vehicle with direction </w:t>
       </w:r>
-      <w:proofErr w:type="spellStart"/>
       <w:r>
         <w:rPr>
           <w:b/>
@@ -7016,7 +8781,6 @@
         </w:rPr>
         <w:t>n</w:t>
       </w:r>
-      <w:proofErr w:type="spellEnd"/>
       <w:r>
         <w:rPr>
           <w:lang w:eastAsia="en-US"/>
@@ -7066,7 +8830,6 @@
         <w:rPr>
           <w:lang w:eastAsia="en-US"/>
         </w:rPr>
-        <w:lastRenderedPageBreak/>
         <w:t>Given the above, zone violations are reported for relevant zones for a vehicle as follows:</w:t>
       </w:r>
     </w:p>
@@ -7095,16 +8858,32 @@
           <w:bCs/>
           <w:lang w:eastAsia="en-US"/>
         </w:rPr>
-        <w:t xml:space="preserve"> Keep-Out Zone Violations:</w:t>
-      </w:r>
-      <w:r>
-        <w:rPr>
-          <w:lang w:eastAsia="en-US"/>
-        </w:rPr>
         <w:t xml:space="preserve"> </w:t>
       </w:r>
       <w:r>
         <w:rPr>
+          <w:b/>
+          <w:bCs/>
+          <w:lang w:eastAsia="en-US"/>
+        </w:rPr>
+        <w:t xml:space="preserve">Projected </w:t>
+      </w:r>
+      <w:r>
+        <w:rPr>
+          <w:b/>
+          <w:bCs/>
+          <w:lang w:eastAsia="en-US"/>
+        </w:rPr>
+        <w:t>Keep-Out Zone Violations:</w:t>
+      </w:r>
+      <w:r>
+        <w:rPr>
+          <w:lang w:eastAsia="en-US"/>
+        </w:rPr>
+        <w:t xml:space="preserve"> </w:t>
+      </w:r>
+      <w:r>
+        <w:rPr>
           <w:lang w:eastAsia="en-US"/>
         </w:rPr>
         <w:t xml:space="preserve">A projected violation of </w:t>
@@ -7113,7 +8892,19 @@
         <w:rPr>
           <w:lang w:eastAsia="en-US"/>
         </w:rPr>
-        <w:t xml:space="preserve">keep-out zone by a vehicle is reported if the zone is </w:t>
+        <w:t xml:space="preserve">keep-out zone by a vehicle is reported if the </w:t>
+      </w:r>
+      <w:r>
+        <w:rPr>
+          <w:lang w:eastAsia="en-US"/>
+        </w:rPr>
+        <w:t xml:space="preserve">projected </w:t>
+      </w:r>
+      <w:r>
+        <w:rPr>
+          <w:lang w:eastAsia="en-US"/>
+        </w:rPr>
+        <w:t xml:space="preserve">zone is </w:t>
       </w:r>
       <w:r>
         <w:rPr>
@@ -7149,7 +8940,19 @@
         <w:rPr>
           <w:lang w:eastAsia="en-US"/>
         </w:rPr>
-        <w:t xml:space="preserve">is on or inside the zone. </w:t>
+        <w:t xml:space="preserve">is on or inside the </w:t>
+      </w:r>
+      <w:r>
+        <w:rPr>
+          <w:lang w:eastAsia="en-US"/>
+        </w:rPr>
+        <w:t xml:space="preserve">projected </w:t>
+      </w:r>
+      <w:r>
+        <w:rPr>
+          <w:lang w:eastAsia="en-US"/>
+        </w:rPr>
+        <w:t xml:space="preserve">zone. </w:t>
       </w:r>
       <w:r>
         <w:rPr>
@@ -7201,7 +9004,23 @@
           <w:bCs/>
           <w:lang w:eastAsia="en-US"/>
         </w:rPr>
-        <w:t xml:space="preserve"> Keep-In Zone Violations: </w:t>
+        <w:t xml:space="preserve"> </w:t>
+      </w:r>
+      <w:r>
+        <w:rPr>
+          <w:b/>
+          <w:bCs/>
+          <w:lang w:eastAsia="en-US"/>
+        </w:rPr>
+        <w:t xml:space="preserve">Projected </w:t>
+      </w:r>
+      <w:r>
+        <w:rPr>
+          <w:b/>
+          <w:bCs/>
+          <w:lang w:eastAsia="en-US"/>
+        </w:rPr>
+        <w:t xml:space="preserve">Keep-In Zone Violations: </w:t>
       </w:r>
       <w:r>
         <w:rPr>
@@ -7219,7 +9038,31 @@
         <w:rPr>
           <w:lang w:eastAsia="en-US"/>
         </w:rPr>
-        <w:t xml:space="preserve">for a vehicle and keep-in zone if a vehicle is in the zone at time </w:t>
+        <w:t>for a vehicle and keep-in zone if a vehicle</w:t>
+      </w:r>
+      <w:r>
+        <w:rPr>
+          <w:lang w:eastAsia="en-US"/>
+        </w:rPr>
+        <w:t>’s projected position</w:t>
+      </w:r>
+      <w:r>
+        <w:rPr>
+          <w:lang w:eastAsia="en-US"/>
+        </w:rPr>
+        <w:t xml:space="preserve"> is in </w:t>
+      </w:r>
+      <w:r>
+        <w:rPr>
+          <w:lang w:eastAsia="en-US"/>
+        </w:rPr>
+        <w:t>or on the projected</w:t>
+      </w:r>
+      <w:r>
+        <w:rPr>
+          <w:lang w:eastAsia="en-US"/>
+        </w:rPr>
+        <w:t xml:space="preserve"> zone at time </w:t>
       </w:r>
       <w:r>
         <w:rPr>
@@ -7242,7 +9085,19 @@
         <w:rPr>
           <w:lang w:eastAsia="en-US"/>
         </w:rPr>
-        <w:t xml:space="preserve"> (at the beginning of its parametric linear trajectory) and has any points on the line segment that are outside of all keep-in zones. The earliest time of any such violation is the reported violation time between the vehicle and the zone.</w:t>
+        <w:t xml:space="preserve"> (at the beginning of its parametric linear trajectory) and has any points on the </w:t>
+      </w:r>
+      <w:r>
+        <w:rPr>
+          <w:lang w:eastAsia="en-US"/>
+        </w:rPr>
+        <w:t xml:space="preserve">projected </w:t>
+      </w:r>
+      <w:r>
+        <w:rPr>
+          <w:lang w:eastAsia="en-US"/>
+        </w:rPr>
+        <w:t>line segment that are outside of all keep-in zones. The earliest time of any such violation is the reported violation time between the vehicle and the zone.</w:t>
       </w:r>
       <w:r>
         <w:rPr>
@@ -7254,7 +9109,25 @@
         <w:rPr>
           <w:noProof/>
         </w:rPr>
-        <w:t>This is reported for the polygonal boudnary of a zone as illustrated in the top-down view of the figure below.</w:t>
+        <w:t xml:space="preserve">This is reported for the polygonal </w:t>
+      </w:r>
+      <w:r>
+        <w:rPr>
+          <w:noProof/>
+        </w:rPr>
+        <w:t xml:space="preserve">projected </w:t>
+      </w:r>
+      <w:r>
+        <w:rPr>
+          <w:noProof/>
+        </w:rPr>
+        <w:t>boundary</w:t>
+      </w:r>
+      <w:r>
+        <w:rPr>
+          <w:noProof/>
+        </w:rPr>
+        <w:t xml:space="preserve"> of a zone as illustrated in the top-down view of the figure below.</w:t>
       </w:r>
     </w:p>
     <w:p>
@@ -7268,6 +9141,7 @@
         <w:rPr>
           <w:noProof/>
         </w:rPr>
+        <w:lastRenderedPageBreak/>
         <mc:AlternateContent>
           <mc:Choice Requires="wpg">
             <w:drawing>
@@ -7391,7 +9265,6 @@
                                   </w14:textOutline>
                                 </w:rPr>
                               </w:pPr>
-                              <w:proofErr w:type="spellStart"/>
                               <w:r>
                                 <w:rPr>
                                   <w:color w:val="000000" w:themeColor="text1"/>
@@ -7424,7 +9297,6 @@
                                 </w:rPr>
                                 <w:t>s+Tw</w:t>
                               </w:r>
-                              <w:proofErr w:type="spellEnd"/>
                             </w:p>
                           </w:txbxContent>
                         </wps:txbx>
@@ -8327,7 +10199,31 @@
         <w:rPr>
           <w:lang w:eastAsia="en-US"/>
         </w:rPr>
-        <w:t>If a violation is projected to occur, a notification is sent to all subscribers for the given vehicle. The notification presents the following data to subscribers:</w:t>
+        <w:t>If a</w:t>
+      </w:r>
+      <w:r>
+        <w:rPr>
+          <w:lang w:eastAsia="en-US"/>
+        </w:rPr>
+        <w:t>n imminent</w:t>
+      </w:r>
+      <w:r>
+        <w:rPr>
+          <w:lang w:eastAsia="en-US"/>
+        </w:rPr>
+        <w:t xml:space="preserve"> violation is </w:t>
+      </w:r>
+      <w:r>
+        <w:rPr>
+          <w:lang w:eastAsia="en-US"/>
+        </w:rPr>
+        <w:t>detected</w:t>
+      </w:r>
+      <w:r>
+        <w:rPr>
+          <w:lang w:eastAsia="en-US"/>
+        </w:rPr>
+        <w:t>, a notification is sent to all subscribers for the given vehicle. The notification presents the following data to subscribers:</w:t>
       </w:r>
     </w:p>
     <w:p>
@@ -8401,7 +10297,6 @@
         </w:rPr>
         <w:t xml:space="preserve">The position, </w:t>
       </w:r>
-      <w:proofErr w:type="spellStart"/>
       <w:r>
         <w:rPr>
           <w:b/>
@@ -8417,7 +10312,6 @@
         </w:rPr>
         <w:t>Tv</w:t>
       </w:r>
-      <w:proofErr w:type="spellEnd"/>
       <w:r>
         <w:rPr>
           <w:lang w:eastAsia="en-US"/>
@@ -8459,35 +10353,77 @@
         <w:rPr>
           <w:lang w:eastAsia="en-US"/>
         </w:rPr>
-        <w:t>Past Projected Violations Are Not Reported</w:t>
+        <w:t>Past</w:t>
+      </w:r>
+      <w:r>
+        <w:rPr>
+          <w:lang w:eastAsia="en-US"/>
+        </w:rPr>
+        <w:t xml:space="preserve"> Imminent </w:t>
+      </w:r>
+      <w:r>
+        <w:rPr>
+          <w:lang w:eastAsia="en-US"/>
+        </w:rPr>
+        <w:t>Projected</w:t>
+      </w:r>
+      <w:r>
+        <w:rPr>
+          <w:lang w:eastAsia="en-US"/>
+        </w:rPr>
+        <w:t xml:space="preserve"> Zone</w:t>
+      </w:r>
+      <w:r>
+        <w:rPr>
+          <w:lang w:eastAsia="en-US"/>
+        </w:rPr>
+        <w:t xml:space="preserve"> Violations Are Not Reported</w:t>
       </w:r>
     </w:p>
     <w:p>
       <w:pPr>
+        <w:pStyle w:val="Heading2Num"/>
+        <w:rPr>
+          <w:rFonts w:eastAsiaTheme="minorEastAsia"/>
+        </w:rPr>
+      </w:pPr>
+      <w:bookmarkStart w:id="22" w:name="_Toc184219181"/>
+      <w:r>
+        <w:rPr>
+          <w:rFonts w:eastAsiaTheme="minorEastAsia"/>
+        </w:rPr>
+        <w:t>Case 4: Not Reporting Past Imminent Projected Zone Violations</w:t>
+      </w:r>
+      <w:bookmarkEnd w:id="22"/>
+    </w:p>
+    <w:p>
+      <w:pPr>
         <w:ind w:firstLine="0"/>
         <w:rPr>
           <w:lang w:eastAsia="en-US"/>
         </w:rPr>
       </w:pPr>
-      <w:r>
-        <w:rPr>
-          <w:lang w:eastAsia="en-US"/>
-        </w:rPr>
-        <w:t xml:space="preserve">Note that this vector does not include positions along the vector for </w:t>
-      </w:r>
       <w:r>
         <w:rPr>
           <w:b/>
           <w:bCs/>
           <w:lang w:eastAsia="en-US"/>
         </w:rPr>
-        <w:t>t</w:t>
-      </w:r>
-      <w:r>
-        <w:rPr>
-          <w:lang w:eastAsia="en-US"/>
-        </w:rPr>
-        <w:t>&lt;</w:t>
+        <w:t xml:space="preserve">The service </w:t>
+      </w:r>
+      <w:r>
+        <w:rPr>
+          <w:b/>
+          <w:bCs/>
+          <w:lang w:eastAsia="en-US"/>
+        </w:rPr>
+        <w:t>will not report projected violations that only occur in the past relative to the current iteration time of the service</w:t>
+      </w:r>
+      <w:r>
+        <w:rPr>
+          <w:lang w:eastAsia="en-US"/>
+        </w:rPr>
+        <w:t xml:space="preserve">.  Below is a figure showing two example projections of violation, but one is in the past from </w:t>
       </w:r>
       <w:r>
         <w:rPr>
@@ -8504,13 +10440,27 @@
           <w:vertAlign w:val="subscript"/>
           <w:lang w:eastAsia="en-US"/>
         </w:rPr>
-        <w:t>p</w:t>
-      </w:r>
-      <w:r>
-        <w:rPr>
-          <w:lang w:eastAsia="en-US"/>
-        </w:rPr>
-        <w:t xml:space="preserve">. We will not report projected violations that only occur in the past relative to the current iteration time of the service.  Below is a figure showing two example projections of violation, but one is in the past from </w:t>
+        <w:t>s</w:t>
+      </w:r>
+      <w:r>
+        <w:rPr>
+          <w:lang w:eastAsia="en-US"/>
+        </w:rPr>
+        <w:t>&lt;=</w:t>
+      </w:r>
+      <w:r>
+        <w:rPr>
+          <w:b/>
+          <w:bCs/>
+          <w:lang w:eastAsia="en-US"/>
+        </w:rPr>
+        <w:t>t</w:t>
+      </w:r>
+      <w:r>
+        <w:rPr>
+          <w:lang w:eastAsia="en-US"/>
+        </w:rPr>
+        <w:t>&lt;</w:t>
       </w:r>
       <w:r>
         <w:rPr>
@@ -8527,43 +10477,6 @@
           <w:vertAlign w:val="subscript"/>
           <w:lang w:eastAsia="en-US"/>
         </w:rPr>
-        <w:t>s</w:t>
-      </w:r>
-      <w:r>
-        <w:rPr>
-          <w:lang w:eastAsia="en-US"/>
-        </w:rPr>
-        <w:t>&lt;=</w:t>
-      </w:r>
-      <w:r>
-        <w:rPr>
-          <w:b/>
-          <w:bCs/>
-          <w:lang w:eastAsia="en-US"/>
-        </w:rPr>
-        <w:t>t</w:t>
-      </w:r>
-      <w:r>
-        <w:rPr>
-          <w:lang w:eastAsia="en-US"/>
-        </w:rPr>
-        <w:t>&lt;</w:t>
-      </w:r>
-      <w:r>
-        <w:rPr>
-          <w:b/>
-          <w:bCs/>
-          <w:lang w:eastAsia="en-US"/>
-        </w:rPr>
-        <w:t>T</w:t>
-      </w:r>
-      <w:r>
-        <w:rPr>
-          <w:b/>
-          <w:bCs/>
-          <w:vertAlign w:val="subscript"/>
-          <w:lang w:eastAsia="en-US"/>
-        </w:rPr>
         <w:t>p</w:t>
       </w:r>
       <w:r>
@@ -8597,18 +10510,16 @@
     </w:p>
     <w:p>
       <w:pPr>
-        <w:pStyle w:val="Heading3"/>
-        <w:rPr>
-          <w:lang w:eastAsia="en-US"/>
-        </w:rPr>
-      </w:pPr>
-      <w:r>
-        <w:rPr>
-          <w:lang w:eastAsia="en-US"/>
-        </w:rPr>
-        <w:lastRenderedPageBreak/>
+        <w:pStyle w:val="Heading2Num"/>
+      </w:pPr>
+      <w:bookmarkStart w:id="23" w:name="_Toc184219182"/>
+      <w:r>
+        <w:t xml:space="preserve">Case 5: </w:t>
+      </w:r>
+      <w:r>
         <w:t>Repeating Reports</w:t>
       </w:r>
+      <w:bookmarkEnd w:id="23"/>
     </w:p>
     <w:p>
       <w:pPr>
@@ -8646,19 +10557,20 @@
         <w:t>This may generate significant network traffic.</w:t>
       </w:r>
     </w:p>
+    <w:bookmarkStart w:id="24" w:name="_Toc184219183"/>
     <w:p>
       <w:pPr>
-        <w:pStyle w:val="Heading2"/>
-        <w:ind w:left="0" w:firstLine="0"/>
-        <w:rPr>
-          <w:rFonts w:eastAsiaTheme="minorEastAsia"/>
-        </w:rPr>
-      </w:pPr>
-      <w:r>
-        <w:rPr>
-          <w:rFonts w:eastAsiaTheme="minorEastAsia"/>
-          <w:noProof/>
-        </w:rPr>
+        <w:pStyle w:val="Heading2Num"/>
+        <w:rPr>
+          <w:rFonts w:eastAsiaTheme="minorEastAsia"/>
+        </w:rPr>
+      </w:pPr>
+      <w:r>
+        <w:rPr>
+          <w:rFonts w:eastAsiaTheme="minorEastAsia"/>
+          <w:noProof/>
+        </w:rPr>
+        <w:lastRenderedPageBreak/>
         <mc:AlternateContent>
           <mc:Choice Requires="wps">
             <w:drawing>
@@ -8742,7 +10654,13 @@
         <w:rPr>
           <w:rFonts w:eastAsiaTheme="minorEastAsia"/>
         </w:rPr>
-        <w:t>Case 4</w:t>
+        <w:t xml:space="preserve">Case </w:t>
+      </w:r>
+      <w:r>
+        <w:rPr>
+          <w:rFonts w:eastAsiaTheme="minorEastAsia"/>
+        </w:rPr>
+        <w:t>6</w:t>
       </w:r>
       <w:r>
         <w:rPr>
@@ -8768,6 +10686,7 @@
         </w:rPr>
         <w:t>Applying Route Information to Projected Violations</w:t>
       </w:r>
+      <w:bookmarkEnd w:id="24"/>
     </w:p>
     <w:p>
       <w:pPr>
@@ -10113,29 +12032,41 @@
     </w:p>
     <w:p>
       <w:pPr>
-        <w:pStyle w:val="Heading2"/>
-        <w:rPr>
-          <w:rFonts w:eastAsiaTheme="minorEastAsia"/>
-        </w:rPr>
-      </w:pPr>
-      <w:r>
-        <w:rPr>
-          <w:rFonts w:eastAsiaTheme="minorEastAsia"/>
-        </w:rPr>
-        <w:lastRenderedPageBreak/>
+        <w:pStyle w:val="Heading2Num"/>
+        <w:rPr>
+          <w:rFonts w:eastAsiaTheme="minorEastAsia"/>
+        </w:rPr>
+      </w:pPr>
+      <w:bookmarkStart w:id="25" w:name="_Toc184219184"/>
+      <w:r>
+        <w:rPr>
+          <w:rFonts w:eastAsiaTheme="minorEastAsia"/>
+        </w:rPr>
         <w:t xml:space="preserve">Case </w:t>
       </w:r>
       <w:r>
         <w:rPr>
           <w:rFonts w:eastAsiaTheme="minorEastAsia"/>
         </w:rPr>
-        <w:t>5. Rejected</w:t>
-      </w:r>
-      <w:r>
-        <w:rPr>
-          <w:rFonts w:eastAsiaTheme="minorEastAsia"/>
-        </w:rPr>
-        <w:t xml:space="preserve">: </w:t>
+        <w:t>7</w:t>
+      </w:r>
+      <w:r>
+        <w:rPr>
+          <w:rFonts w:eastAsiaTheme="minorEastAsia"/>
+        </w:rPr>
+        <w:t>. Rejected</w:t>
+      </w:r>
+      <w:r>
+        <w:rPr>
+          <w:rFonts w:eastAsiaTheme="minorEastAsia"/>
+        </w:rPr>
+        <w:t>.</w:t>
+      </w:r>
+      <w:r>
+        <w:rPr>
+          <w:rFonts w:eastAsiaTheme="minorEastAsia"/>
+        </w:rPr>
+        <w:t xml:space="preserve"> </w:t>
       </w:r>
       <w:r>
         <w:rPr>
@@ -10149,6 +12080,7 @@
         </w:rPr>
         <w:t xml:space="preserve"> Rather than Reported Time</w:t>
       </w:r>
+      <w:bookmarkEnd w:id="25"/>
     </w:p>
     <w:p>
       <w:pPr>
@@ -11072,16 +13004,29 @@
     </w:p>
     <w:p>
       <w:pPr>
-        <w:pStyle w:val="Heading2"/>
-        <w:rPr>
-          <w:rFonts w:eastAsiaTheme="minorEastAsia"/>
-        </w:rPr>
-      </w:pPr>
-      <w:r>
-        <w:rPr>
-          <w:rFonts w:eastAsiaTheme="minorEastAsia"/>
-        </w:rPr>
-        <w:t>Case 6.  Ignoring Likely Violations that</w:t>
+        <w:pStyle w:val="Heading2Num"/>
+        <w:rPr>
+          <w:rFonts w:eastAsiaTheme="minorEastAsia"/>
+        </w:rPr>
+      </w:pPr>
+      <w:bookmarkStart w:id="26" w:name="_Toc184219185"/>
+      <w:r>
+        <w:rPr>
+          <w:rFonts w:eastAsiaTheme="minorEastAsia"/>
+        </w:rPr>
+        <w:t xml:space="preserve">Case </w:t>
+      </w:r>
+      <w:r>
+        <w:rPr>
+          <w:rFonts w:eastAsiaTheme="minorEastAsia"/>
+        </w:rPr>
+        <w:t>8</w:t>
+      </w:r>
+      <w:r>
+        <w:rPr>
+          <w:rFonts w:eastAsiaTheme="minorEastAsia"/>
+        </w:rPr>
+        <w:t>.  Ignoring Likely Violations that</w:t>
       </w:r>
       <w:r>
         <w:rPr>
@@ -11093,8 +13038,15 @@
         <w:rPr>
           <w:rFonts w:eastAsiaTheme="minorEastAsia"/>
         </w:rPr>
-        <w:t>Occurred Between State Reports</w:t>
-      </w:r>
+        <w:t>Occurred</w:t>
+      </w:r>
+      <w:r>
+        <w:rPr>
+          <w:rFonts w:eastAsiaTheme="minorEastAsia"/>
+        </w:rPr>
+        <w:t xml:space="preserve"> Between State Reports</w:t>
+      </w:r>
+      <w:bookmarkEnd w:id="26"/>
       <w:r>
         <w:rPr>
           <w:rFonts w:eastAsiaTheme="minorEastAsia"/>
@@ -11114,6 +13066,7 @@
           <w:rFonts w:eastAsiaTheme="minorEastAsia"/>
           <w:noProof/>
         </w:rPr>
+        <w:lastRenderedPageBreak/>
         <mc:AlternateContent>
           <mc:Choice Requires="wpg">
             <w:drawing>
@@ -12029,17 +13982,34 @@
     </w:p>
     <w:p>
       <w:pPr>
-        <w:pStyle w:val="Heading2"/>
-        <w:rPr>
-          <w:lang w:eastAsia="en-US"/>
-        </w:rPr>
-      </w:pPr>
-      <w:r>
-        <w:rPr>
-          <w:lang w:eastAsia="en-US"/>
-        </w:rPr>
-        <w:t>Case 7: Boundary Skimming Behavior</w:t>
-      </w:r>
+        <w:pStyle w:val="Heading2Num"/>
+        <w:rPr>
+          <w:lang w:eastAsia="en-US"/>
+        </w:rPr>
+      </w:pPr>
+      <w:bookmarkStart w:id="27" w:name="_Toc184219186"/>
+      <w:r>
+        <w:rPr>
+          <w:lang w:eastAsia="en-US"/>
+        </w:rPr>
+        <w:t xml:space="preserve">Case </w:t>
+      </w:r>
+      <w:r>
+        <w:rPr>
+          <w:lang w:eastAsia="en-US"/>
+        </w:rPr>
+        <w:t>9</w:t>
+      </w:r>
+      <w:r>
+        <w:rPr>
+          <w:lang w:eastAsia="en-US"/>
+        </w:rPr>
+        <w:t xml:space="preserve">: Boundary Skimming </w:t>
+      </w:r>
+      <w:r>
+        <w:t>Behavior</w:t>
+      </w:r>
+      <w:bookmarkEnd w:id="27"/>
     </w:p>
     <w:p>
       <w:pPr>
@@ -12080,17 +14050,17 @@
         <w:rPr>
           <w:rFonts w:eastAsiaTheme="minorEastAsia"/>
         </w:rPr>
-        <w:lastRenderedPageBreak/>
         <w:t>OpenUxAS is currently applied to the AMASE vehicle simulator. If OpenUxAS were to be used with real-world reporting and there is noise in vehicle position data over time, then the behavior of the violation alerting behavior is undefined.</w:t>
       </w:r>
     </w:p>
     <w:p>
       <w:pPr>
-        <w:pStyle w:val="Heading2"/>
-        <w:rPr>
-          <w:lang w:eastAsia="en-US"/>
-        </w:rPr>
-      </w:pPr>
+        <w:pStyle w:val="Heading2Num"/>
+        <w:rPr>
+          <w:lang w:eastAsia="en-US"/>
+        </w:rPr>
+      </w:pPr>
+      <w:bookmarkStart w:id="28" w:name="_Toc184219187"/>
       <w:r>
         <w:rPr>
           <w:lang w:eastAsia="en-US"/>
@@ -12101,7 +14071,7 @@
         <w:rPr>
           <w:lang w:eastAsia="en-US"/>
         </w:rPr>
-        <w:t>8</w:t>
+        <w:t>10</w:t>
       </w:r>
       <w:r>
         <w:rPr>
@@ -12113,7 +14083,19 @@
         <w:rPr>
           <w:lang w:eastAsia="en-US"/>
         </w:rPr>
-        <w:t xml:space="preserve">Rejected: </w:t>
+        <w:t>Rejecte</w:t>
+      </w:r>
+      <w:r>
+        <w:rPr>
+          <w:lang w:eastAsia="en-US"/>
+        </w:rPr>
+        <w:t>d.</w:t>
+      </w:r>
+      <w:r>
+        <w:rPr>
+          <w:lang w:eastAsia="en-US"/>
+        </w:rPr>
+        <w:t xml:space="preserve"> </w:t>
       </w:r>
       <w:r>
         <w:rPr>
@@ -12127,6 +14109,7 @@
         </w:rPr>
         <w:t xml:space="preserve"> on Stale Vehicle Reports</w:t>
       </w:r>
+      <w:bookmarkEnd w:id="28"/>
     </w:p>
     <w:p>
       <w:pPr>
@@ -12144,24 +14127,23 @@
     </w:p>
     <w:p>
       <w:pPr>
-        <w:pStyle w:val="Heading2"/>
-        <w:rPr>
-          <w:rFonts w:eastAsiaTheme="minorEastAsia"/>
-        </w:rPr>
-      </w:pPr>
-      <w:r>
-        <w:rPr>
-          <w:rFonts w:eastAsiaTheme="minorEastAsia"/>
-          <w:bCs/>
+        <w:pStyle w:val="Heading2Num"/>
+        <w:rPr>
+          <w:rFonts w:eastAsiaTheme="minorEastAsia"/>
+        </w:rPr>
+      </w:pPr>
+      <w:bookmarkStart w:id="29" w:name="_Toc184219188"/>
+      <w:r>
+        <w:rPr>
+          <w:rFonts w:eastAsiaTheme="minorEastAsia"/>
         </w:rPr>
         <w:t xml:space="preserve">Case </w:t>
       </w:r>
       <w:r>
         <w:rPr>
           <w:rFonts w:eastAsiaTheme="minorEastAsia"/>
-          <w:bCs/>
-        </w:rPr>
-        <w:t>9</w:t>
+        </w:rPr>
+        <w:t>11</w:t>
       </w:r>
       <w:r>
         <w:rPr>
@@ -12173,22 +14155,21 @@
         <w:rPr>
           <w:rFonts w:eastAsiaTheme="minorEastAsia"/>
         </w:rPr>
-        <w:t xml:space="preserve">Rejected Reporting only on Zones </w:t>
-      </w:r>
-      <w:proofErr w:type="gramStart"/>
-      <w:r>
-        <w:rPr>
-          <w:rFonts w:eastAsiaTheme="minorEastAsia"/>
-        </w:rPr>
-        <w:t>In</w:t>
-      </w:r>
-      <w:proofErr w:type="gramEnd"/>
-      <w:r>
-        <w:rPr>
-          <w:rFonts w:eastAsiaTheme="minorEastAsia"/>
-        </w:rPr>
-        <w:t xml:space="preserve"> Vehicle’s Assigned Operating Regions</w:t>
-      </w:r>
+        <w:t>Rejected</w:t>
+      </w:r>
+      <w:r>
+        <w:rPr>
+          <w:rFonts w:eastAsiaTheme="minorEastAsia"/>
+        </w:rPr>
+        <w:t>.</w:t>
+      </w:r>
+      <w:r>
+        <w:rPr>
+          <w:rFonts w:eastAsiaTheme="minorEastAsia"/>
+        </w:rPr>
+        <w:t xml:space="preserve"> Reporting only on Zones In Vehicle’s Assigned Operating Regions</w:t>
+      </w:r>
+      <w:bookmarkEnd w:id="29"/>
     </w:p>
     <w:p>
       <w:pPr>

</xml_diff>